<commit_message>
phase 1 technical research notebook completed
</commit_message>
<xml_diff>
--- a/Phase1/Technical Research Notebook.docx
+++ b/Phase1/Technical Research Notebook.docx
@@ -68,42 +68,6 @@
     </w:p>
     <w:p>
       <w:r>
-        <w:pict w14:anchorId="3F19E2F3">
-          <v:rect id="_x0000_i1025" style="width:0;height:1.5pt" o:hralign="center" o:hrstd="t" o:hr="t"/>
-        </w:pict>
-      </w:r>
-    </w:p>
-    <w:p>
-      <w:pPr>
-        <w:pStyle w:val="BlockText"/>
-      </w:pPr>
-      <w:r>
-        <w:rPr>
-          <w:b/>
-          <w:bCs/>
-        </w:rPr>
-        <w:t>How to use this notebook:</w:t>
-      </w:r>
-      <w:r>
-        <w:t xml:space="preserve"> - Treat this as your living lab notebook for Phase 1. Keep entries chronological and annotate every external source with URL + short note.</w:t>
-      </w:r>
-      <w:r>
-        <w:br/>
-        <w:t xml:space="preserve">- </w:t>
-      </w:r>
-      <w:r>
-        <w:rPr>
-          <w:b/>
-          <w:bCs/>
-        </w:rPr>
-        <w:t>DO NOT</w:t>
-      </w:r>
-      <w:r>
-        <w:t xml:space="preserve"> include real users’ PII or run third-party plugins on real accounts. Work only with public code and controlled dummy accounts.</w:t>
-      </w:r>
-    </w:p>
-    <w:p>
-      <w:r>
         <w:pict w14:anchorId="5F2464A2">
           <v:rect id="_x0000_i1026" style="width:0;height:1.5pt" o:hralign="center" o:hrstd="t" o:hr="t"/>
         </w:pict>
@@ -187,7 +151,15 @@
         </w:numPr>
       </w:pPr>
       <w:r>
-        <w:t>Findings Synthesis (2–3 page summary)</w:t>
+        <w:t>Findings Synthesis (2–</w:t>
+      </w:r>
+      <w:proofErr w:type="gramStart"/>
+      <w:r>
+        <w:t>3 page</w:t>
+      </w:r>
+      <w:proofErr w:type="gramEnd"/>
+      <w:r>
+        <w:t xml:space="preserve"> summary)</w:t>
       </w:r>
     </w:p>
     <w:p>
@@ -243,7 +215,15 @@
         <w:t>Scope (short):</w:t>
       </w:r>
       <w:r>
-        <w:t xml:space="preserve"> Discord (primary), public client-side mods (e.g., Vencord), ephemeral messaging behaviors, local cache artifacts, and conceptual AI pipelines.</w:t>
+        <w:t xml:space="preserve"> Discord (primary), public client-side mods (e.g., </w:t>
+      </w:r>
+      <w:proofErr w:type="spellStart"/>
+      <w:r>
+        <w:t>Vencord</w:t>
+      </w:r>
+      <w:proofErr w:type="spellEnd"/>
+      <w:r>
+        <w:t>), ephemeral messaging behaviors, local cache artifacts, and conceptual AI pipelines.</w:t>
       </w:r>
     </w:p>
     <w:p>
@@ -299,7 +279,15 @@
         <w:pStyle w:val="FirstParagraph"/>
       </w:pPr>
       <w:r>
-        <w:t>Add at least 8–10 entries here. For each entry use this mini-template:</w:t>
+        <w:t xml:space="preserve">Add at least 8–10 entries here. For each entry use this </w:t>
+      </w:r>
+      <w:proofErr w:type="gramStart"/>
+      <w:r>
+        <w:t>mini-template</w:t>
+      </w:r>
+      <w:proofErr w:type="gramEnd"/>
+      <w:r>
+        <w:t>:</w:t>
       </w:r>
     </w:p>
     <w:p>
@@ -365,7 +353,6 @@
       <w:bookmarkStart w:id="4" w:name="plugin-audit-table-static-analysis"/>
       <w:bookmarkEnd w:id="3"/>
       <w:r>
-        <w:lastRenderedPageBreak/>
         <w:t>3. Plugin Audit Table (static analysis)</w:t>
       </w:r>
     </w:p>
@@ -690,13 +677,23 @@
                 <w:szCs w:val="16"/>
               </w:rPr>
             </w:pPr>
-            <w:r>
-              <w:rPr>
-                <w:rFonts w:ascii="Times New Roman" w:eastAsia="Times New Roman" w:hAnsi="Times New Roman" w:cs="Times New Roman"/>
-                <w:sz w:val="16"/>
-                <w:szCs w:val="16"/>
-              </w:rPr>
-              <w:t xml:space="preserve">MessageLogger (for </w:t>
+            <w:proofErr w:type="spellStart"/>
+            <w:r>
+              <w:rPr>
+                <w:rFonts w:ascii="Times New Roman" w:eastAsia="Times New Roman" w:hAnsi="Times New Roman" w:cs="Times New Roman"/>
+                <w:sz w:val="16"/>
+                <w:szCs w:val="16"/>
+              </w:rPr>
+              <w:t>MessageLogger</w:t>
+            </w:r>
+            <w:proofErr w:type="spellEnd"/>
+            <w:r>
+              <w:rPr>
+                <w:rFonts w:ascii="Times New Roman" w:eastAsia="Times New Roman" w:hAnsi="Times New Roman" w:cs="Times New Roman"/>
+                <w:sz w:val="16"/>
+                <w:szCs w:val="16"/>
+              </w:rPr>
+              <w:t xml:space="preserve"> (for </w:t>
             </w:r>
             <w:proofErr w:type="spellStart"/>
             <w:r>
@@ -739,38 +736,25 @@
                 <w:sz w:val="16"/>
                 <w:szCs w:val="16"/>
               </w:rPr>
-              <w:t>“Temporarily logs deleted and edited messages.” (</w:t>
-            </w:r>
-            <w:proofErr w:type="spellStart"/>
-            <w:r>
-              <w:rPr>
-                <w:rFonts w:ascii="Times New Roman" w:eastAsia="Times New Roman" w:hAnsi="Times New Roman" w:cs="Times New Roman"/>
-                <w:sz w:val="16"/>
-                <w:szCs w:val="16"/>
-              </w:rPr>
+              <w:t>“Temporarily logs deleted and edited messages.</w:t>
+            </w:r>
+            <w:r>
+              <w:rPr>
+                <w:rFonts w:ascii="Times New Roman" w:eastAsia="Times New Roman" w:hAnsi="Times New Roman" w:cs="Times New Roman"/>
+                <w:sz w:val="16"/>
+                <w:szCs w:val="16"/>
+              </w:rPr>
+              <w:lastRenderedPageBreak/>
+              <w:t>” (</w:t>
+            </w:r>
+            <w:proofErr w:type="spellStart"/>
+            <w:r>
               <w:fldChar w:fldCharType="begin"/>
             </w:r>
             <w:r>
-              <w:rPr>
-                <w:rFonts w:ascii="Times New Roman" w:eastAsia="Times New Roman" w:hAnsi="Times New Roman" w:cs="Times New Roman"/>
-                <w:sz w:val="16"/>
-                <w:szCs w:val="16"/>
-              </w:rPr>
               <w:instrText>HYPERLINK "https://vencord.dev/plugins/MessageLogger?utm_source=chatgpt.com" \o "MessageLogger - Vencord"</w:instrText>
             </w:r>
             <w:r>
-              <w:rPr>
-                <w:rFonts w:ascii="Times New Roman" w:eastAsia="Times New Roman" w:hAnsi="Times New Roman" w:cs="Times New Roman"/>
-                <w:sz w:val="16"/>
-                <w:szCs w:val="16"/>
-              </w:rPr>
-            </w:r>
-            <w:r>
-              <w:rPr>
-                <w:rFonts w:ascii="Times New Roman" w:eastAsia="Times New Roman" w:hAnsi="Times New Roman" w:cs="Times New Roman"/>
-                <w:sz w:val="16"/>
-                <w:szCs w:val="16"/>
-              </w:rPr>
               <w:fldChar w:fldCharType="separate"/>
             </w:r>
             <w:r>
@@ -785,11 +769,6 @@
             </w:r>
             <w:proofErr w:type="spellEnd"/>
             <w:r>
-              <w:rPr>
-                <w:rFonts w:ascii="Times New Roman" w:eastAsia="Times New Roman" w:hAnsi="Times New Roman" w:cs="Times New Roman"/>
-                <w:sz w:val="16"/>
-                <w:szCs w:val="16"/>
-              </w:rPr>
               <w:fldChar w:fldCharType="end"/>
             </w:r>
             <w:r>
@@ -823,6 +802,7 @@
                 <w:sz w:val="16"/>
                 <w:szCs w:val="16"/>
               </w:rPr>
+              <w:lastRenderedPageBreak/>
               <w:t xml:space="preserve">Logs deleted &amp; edited messages; </w:t>
             </w:r>
             <w:proofErr w:type="gramStart"/>
@@ -841,7 +821,16 @@
                 <w:sz w:val="16"/>
                 <w:szCs w:val="16"/>
               </w:rPr>
-              <w:t xml:space="preserve"> searching message history in mods. (</w:t>
+              <w:t xml:space="preserve"> </w:t>
+            </w:r>
+            <w:r>
+              <w:rPr>
+                <w:rFonts w:ascii="Times New Roman" w:eastAsia="Times New Roman" w:hAnsi="Times New Roman" w:cs="Times New Roman"/>
+                <w:sz w:val="16"/>
+                <w:szCs w:val="16"/>
+              </w:rPr>
+              <w:lastRenderedPageBreak/>
+              <w:t>searching message history in mods. (</w:t>
             </w:r>
             <w:hyperlink r:id="rId5" w:tooltip="Syncxv/vc-message-logger-enhanced - GitHub" w:history="1">
               <w:r>
@@ -886,6 +875,7 @@
                 <w:sz w:val="16"/>
                 <w:szCs w:val="16"/>
               </w:rPr>
+              <w:lastRenderedPageBreak/>
               <w:t xml:space="preserve">Hooks into message‐delete / message‐edit events (e.g., </w:t>
             </w:r>
             <w:proofErr w:type="spellStart"/>
@@ -895,7 +885,16 @@
                 <w:sz w:val="16"/>
                 <w:szCs w:val="16"/>
               </w:rPr>
-              <w:t>onMessageDelete</w:t>
+              <w:t>onMessageDel</w:t>
+            </w:r>
+            <w:r>
+              <w:rPr>
+                <w:rFonts w:ascii="Courier New" w:eastAsia="Times New Roman" w:hAnsi="Courier New" w:cs="Courier New"/>
+                <w:sz w:val="16"/>
+                <w:szCs w:val="16"/>
+              </w:rPr>
+              <w:lastRenderedPageBreak/>
+              <w:t>ete</w:t>
             </w:r>
             <w:proofErr w:type="spellEnd"/>
             <w:r>
@@ -968,6 +967,7 @@
                 <w:sz w:val="16"/>
                 <w:szCs w:val="16"/>
               </w:rPr>
+              <w:lastRenderedPageBreak/>
               <w:t>Yes</w:t>
             </w:r>
             <w:proofErr w:type="gramEnd"/>
@@ -1164,7 +1164,16 @@
                 <w:sz w:val="16"/>
                 <w:szCs w:val="16"/>
               </w:rPr>
-              <w:t xml:space="preserve"> (</w:t>
+              <w:t xml:space="preserve"> </w:t>
+            </w:r>
+            <w:r>
+              <w:rPr>
+                <w:rFonts w:ascii="Times New Roman" w:eastAsia="Times New Roman" w:hAnsi="Times New Roman" w:cs="Times New Roman"/>
+                <w:sz w:val="16"/>
+                <w:szCs w:val="16"/>
+              </w:rPr>
+              <w:lastRenderedPageBreak/>
+              <w:t>(</w:t>
             </w:r>
             <w:hyperlink r:id="rId9" w:tooltip="messageLogger: fix ingore guild (#1632) · 6e7996659f" w:history="1">
               <w:r>
@@ -1214,6 +1223,7 @@
                 <w:sz w:val="16"/>
                 <w:szCs w:val="16"/>
               </w:rPr>
+              <w:lastRenderedPageBreak/>
               <w:t>Discord Desktop Client Cache</w:t>
             </w:r>
           </w:p>
@@ -1677,34 +1687,12 @@
             </w:r>
             <w:proofErr w:type="spellStart"/>
             <w:r>
-              <w:rPr>
-                <w:rFonts w:ascii="Times New Roman" w:eastAsia="Times New Roman" w:hAnsi="Times New Roman" w:cs="Times New Roman"/>
-                <w:sz w:val="16"/>
-                <w:szCs w:val="16"/>
-              </w:rPr>
               <w:fldChar w:fldCharType="begin"/>
             </w:r>
             <w:r>
-              <w:rPr>
-                <w:rFonts w:ascii="Times New Roman" w:eastAsia="Times New Roman" w:hAnsi="Times New Roman" w:cs="Times New Roman"/>
-                <w:sz w:val="16"/>
-                <w:szCs w:val="16"/>
-              </w:rPr>
               <w:instrText>HYPERLINK "https://vencord.dev/plugins/AlwaysTrust?utm_source=chatgpt.com" \o "AlwaysTrust - Vencord"</w:instrText>
             </w:r>
             <w:r>
-              <w:rPr>
-                <w:rFonts w:ascii="Times New Roman" w:eastAsia="Times New Roman" w:hAnsi="Times New Roman" w:cs="Times New Roman"/>
-                <w:sz w:val="16"/>
-                <w:szCs w:val="16"/>
-              </w:rPr>
-            </w:r>
-            <w:r>
-              <w:rPr>
-                <w:rFonts w:ascii="Times New Roman" w:eastAsia="Times New Roman" w:hAnsi="Times New Roman" w:cs="Times New Roman"/>
-                <w:sz w:val="16"/>
-                <w:szCs w:val="16"/>
-              </w:rPr>
               <w:fldChar w:fldCharType="separate"/>
             </w:r>
             <w:r>
@@ -1718,11 +1706,6 @@
             </w:r>
             <w:proofErr w:type="spellEnd"/>
             <w:r>
-              <w:rPr>
-                <w:rFonts w:ascii="Times New Roman" w:eastAsia="Times New Roman" w:hAnsi="Times New Roman" w:cs="Times New Roman"/>
-                <w:sz w:val="16"/>
-                <w:szCs w:val="16"/>
-              </w:rPr>
               <w:fldChar w:fldCharType="end"/>
             </w:r>
             <w:r>
@@ -2131,7 +2114,7 @@
             <w:r>
               <w:rPr>
                 <w:rStyle w:val="HTMLCode"/>
-                <w:rFonts w:ascii="Times New Roman" w:hAnsi="Times New Roman" w:cs="Times New Roman"/>
+                <w:rFonts w:ascii="Times New Roman" w:eastAsiaTheme="minorHAnsi" w:hAnsi="Times New Roman" w:cs="Times New Roman"/>
                 <w:sz w:val="16"/>
                 <w:szCs w:val="16"/>
               </w:rPr>
@@ -2141,7 +2124,7 @@
             <w:r>
               <w:rPr>
                 <w:rStyle w:val="HTMLCode"/>
-                <w:rFonts w:ascii="Times New Roman" w:hAnsi="Times New Roman" w:cs="Times New Roman"/>
+                <w:rFonts w:ascii="Times New Roman" w:eastAsiaTheme="minorHAnsi" w:hAnsi="Times New Roman" w:cs="Times New Roman"/>
                 <w:sz w:val="16"/>
                 <w:szCs w:val="16"/>
               </w:rPr>
@@ -2151,7 +2134,7 @@
             <w:r>
               <w:rPr>
                 <w:rStyle w:val="HTMLCode"/>
-                <w:rFonts w:ascii="Times New Roman" w:hAnsi="Times New Roman" w:cs="Times New Roman"/>
+                <w:rFonts w:ascii="Times New Roman" w:eastAsiaTheme="minorHAnsi" w:hAnsi="Times New Roman" w:cs="Times New Roman"/>
                 <w:sz w:val="16"/>
                 <w:szCs w:val="16"/>
               </w:rPr>
@@ -2161,7 +2144,7 @@
             <w:r>
               <w:rPr>
                 <w:rStyle w:val="HTMLCode"/>
-                <w:rFonts w:ascii="Times New Roman" w:hAnsi="Times New Roman" w:cs="Times New Roman"/>
+                <w:rFonts w:ascii="Times New Roman" w:eastAsiaTheme="minorHAnsi" w:hAnsi="Times New Roman" w:cs="Times New Roman"/>
                 <w:sz w:val="16"/>
                 <w:szCs w:val="16"/>
               </w:rPr>
@@ -2341,6 +2324,7 @@
                 <w:szCs w:val="16"/>
               </w:rPr>
             </w:pPr>
+            <w:proofErr w:type="spellStart"/>
             <w:r>
               <w:rPr>
                 <w:rStyle w:val="Strong"/>
@@ -2352,6 +2336,7 @@
               </w:rPr>
               <w:t>MessageLogger</w:t>
             </w:r>
+            <w:proofErr w:type="spellEnd"/>
           </w:p>
         </w:tc>
         <w:tc>
@@ -2438,34 +2423,12 @@
             </w:r>
             <w:proofErr w:type="spellStart"/>
             <w:r>
-              <w:rPr>
-                <w:rFonts w:ascii="Times New Roman" w:eastAsia="Times New Roman" w:hAnsi="Times New Roman" w:cs="Times New Roman"/>
-                <w:sz w:val="16"/>
-                <w:szCs w:val="16"/>
-              </w:rPr>
               <w:fldChar w:fldCharType="begin"/>
             </w:r>
             <w:r>
-              <w:rPr>
-                <w:rFonts w:ascii="Times New Roman" w:eastAsia="Times New Roman" w:hAnsi="Times New Roman" w:cs="Times New Roman"/>
-                <w:sz w:val="16"/>
-                <w:szCs w:val="16"/>
-              </w:rPr>
               <w:instrText>HYPERLINK "https://vencord.dev/plugins/MessageLogger?utm_source=chatgpt.com" \o "MessageLogger"</w:instrText>
             </w:r>
             <w:r>
-              <w:rPr>
-                <w:rFonts w:ascii="Times New Roman" w:eastAsia="Times New Roman" w:hAnsi="Times New Roman" w:cs="Times New Roman"/>
-                <w:sz w:val="16"/>
-                <w:szCs w:val="16"/>
-              </w:rPr>
-            </w:r>
-            <w:r>
-              <w:rPr>
-                <w:rFonts w:ascii="Times New Roman" w:eastAsia="Times New Roman" w:hAnsi="Times New Roman" w:cs="Times New Roman"/>
-                <w:sz w:val="16"/>
-                <w:szCs w:val="16"/>
-              </w:rPr>
               <w:fldChar w:fldCharType="separate"/>
             </w:r>
             <w:r>
@@ -2479,11 +2442,6 @@
             </w:r>
             <w:proofErr w:type="spellEnd"/>
             <w:r>
-              <w:rPr>
-                <w:rFonts w:ascii="Times New Roman" w:eastAsia="Times New Roman" w:hAnsi="Times New Roman" w:cs="Times New Roman"/>
-                <w:sz w:val="16"/>
-                <w:szCs w:val="16"/>
-              </w:rPr>
               <w:fldChar w:fldCharType="end"/>
             </w:r>
             <w:r>
@@ -2558,7 +2516,7 @@
             <w:r>
               <w:rPr>
                 <w:rStyle w:val="HTMLCode"/>
-                <w:rFonts w:ascii="Times New Roman" w:hAnsi="Times New Roman" w:cs="Times New Roman"/>
+                <w:rFonts w:ascii="Times New Roman" w:eastAsiaTheme="minorHAnsi" w:hAnsi="Times New Roman" w:cs="Times New Roman"/>
                 <w:sz w:val="16"/>
                 <w:szCs w:val="16"/>
               </w:rPr>
@@ -2577,7 +2535,7 @@
             <w:r>
               <w:rPr>
                 <w:rStyle w:val="HTMLCode"/>
-                <w:rFonts w:ascii="Times New Roman" w:hAnsi="Times New Roman" w:cs="Times New Roman"/>
+                <w:rFonts w:ascii="Times New Roman" w:eastAsiaTheme="minorHAnsi" w:hAnsi="Times New Roman" w:cs="Times New Roman"/>
                 <w:sz w:val="16"/>
                 <w:szCs w:val="16"/>
               </w:rPr>
@@ -2594,34 +2552,12 @@
             </w:r>
             <w:proofErr w:type="spellStart"/>
             <w:r>
-              <w:rPr>
-                <w:rFonts w:ascii="Times New Roman" w:eastAsia="Times New Roman" w:hAnsi="Times New Roman" w:cs="Times New Roman"/>
-                <w:sz w:val="16"/>
-                <w:szCs w:val="16"/>
-              </w:rPr>
               <w:fldChar w:fldCharType="begin"/>
             </w:r>
             <w:r>
-              <w:rPr>
-                <w:rFonts w:ascii="Times New Roman" w:eastAsia="Times New Roman" w:hAnsi="Times New Roman" w:cs="Times New Roman"/>
-                <w:sz w:val="16"/>
-                <w:szCs w:val="16"/>
-              </w:rPr>
               <w:instrText>HYPERLINK "https://wiki.vencord.dev/index.php?mobileaction=toggle_view_desktop&amp;title=MessageLogger&amp;utm_source=chatgpt.com" \o "MessageLogger - Discord Client Modding Wiki"</w:instrText>
             </w:r>
             <w:r>
-              <w:rPr>
-                <w:rFonts w:ascii="Times New Roman" w:eastAsia="Times New Roman" w:hAnsi="Times New Roman" w:cs="Times New Roman"/>
-                <w:sz w:val="16"/>
-                <w:szCs w:val="16"/>
-              </w:rPr>
-            </w:r>
-            <w:r>
-              <w:rPr>
-                <w:rFonts w:ascii="Times New Roman" w:eastAsia="Times New Roman" w:hAnsi="Times New Roman" w:cs="Times New Roman"/>
-                <w:sz w:val="16"/>
-                <w:szCs w:val="16"/>
-              </w:rPr>
               <w:fldChar w:fldCharType="separate"/>
             </w:r>
             <w:r>
@@ -2635,11 +2571,6 @@
             </w:r>
             <w:proofErr w:type="spellEnd"/>
             <w:r>
-              <w:rPr>
-                <w:rFonts w:ascii="Times New Roman" w:eastAsia="Times New Roman" w:hAnsi="Times New Roman" w:cs="Times New Roman"/>
-                <w:sz w:val="16"/>
-                <w:szCs w:val="16"/>
-              </w:rPr>
               <w:fldChar w:fldCharType="end"/>
             </w:r>
             <w:r>
@@ -2844,7 +2775,15 @@
       </w:r>
       <w:r>
         <w:br/>
-        <w:t>- Local storage methods (filesystem, DB, IndexedDB):</w:t>
+        <w:t xml:space="preserve">- Local storage methods (filesystem, DB, </w:t>
+      </w:r>
+      <w:proofErr w:type="spellStart"/>
+      <w:r>
+        <w:t>IndexedDB</w:t>
+      </w:r>
+      <w:proofErr w:type="spellEnd"/>
+      <w:r>
+        <w:t>):</w:t>
       </w:r>
       <w:r>
         <w:br/>
@@ -2915,7 +2854,6 @@
                 <w:sz w:val="20"/>
                 <w:szCs w:val="20"/>
               </w:rPr>
-              <w:lastRenderedPageBreak/>
               <w:t>Plugin</w:t>
             </w:r>
           </w:p>
@@ -3167,7 +3105,15 @@
                 <w:sz w:val="20"/>
                 <w:szCs w:val="20"/>
               </w:rPr>
-              <w:t xml:space="preserve"> sets up event listeners for message deletion and editing (e.g., </w:t>
+              <w:t xml:space="preserve"> sets up event listeners for message </w:t>
+            </w:r>
+            <w:r>
+              <w:rPr>
+                <w:sz w:val="20"/>
+                <w:szCs w:val="20"/>
+              </w:rPr>
+              <w:lastRenderedPageBreak/>
+              <w:t xml:space="preserve">deletion and editing (e.g., </w:t>
             </w:r>
             <w:proofErr w:type="spellStart"/>
             <w:r>
@@ -3222,6 +3168,7 @@
                 <w:sz w:val="20"/>
                 <w:szCs w:val="20"/>
               </w:rPr>
+              <w:lastRenderedPageBreak/>
               <w:t xml:space="preserve">The README states that the plugin “saves messages to a </w:t>
             </w:r>
             <w:proofErr w:type="spellStart"/>
@@ -3254,7 +3201,15 @@
                 <w:sz w:val="20"/>
                 <w:szCs w:val="20"/>
               </w:rPr>
-              <w:t>” in version 4.0.0. (</w:t>
+              <w:t xml:space="preserve">” in </w:t>
+            </w:r>
+            <w:r>
+              <w:rPr>
+                <w:sz w:val="20"/>
+                <w:szCs w:val="20"/>
+              </w:rPr>
+              <w:lastRenderedPageBreak/>
+              <w:t>version 4.0.0. (</w:t>
             </w:r>
             <w:hyperlink r:id="rId20" w:tooltip="Syncxv/vc-message-logger-enhanced" w:history="1">
               <w:r>
@@ -3318,6 +3273,7 @@
                 <w:sz w:val="20"/>
                 <w:szCs w:val="20"/>
               </w:rPr>
+              <w:lastRenderedPageBreak/>
               <w:t>AlwaysTrust</w:t>
             </w:r>
             <w:proofErr w:type="spellEnd"/>
@@ -3491,30 +3447,12 @@
             </w:r>
             <w:proofErr w:type="spellStart"/>
             <w:r>
-              <w:rPr>
-                <w:sz w:val="20"/>
-                <w:szCs w:val="20"/>
-              </w:rPr>
               <w:fldChar w:fldCharType="begin"/>
             </w:r>
             <w:r>
-              <w:rPr>
-                <w:sz w:val="20"/>
-                <w:szCs w:val="20"/>
-              </w:rPr>
               <w:instrText>HYPERLINK "https://git.catvibers.me/wing/Bencord/src/tag/v1.2.1/src/plugins/alwaysTrust.ts?utm_source=chatgpt.com" \o "Bencord/src/plugins/alwaysTrust.ts at v1.2.1 - Catvibers Git"</w:instrText>
             </w:r>
             <w:r>
-              <w:rPr>
-                <w:sz w:val="20"/>
-                <w:szCs w:val="20"/>
-              </w:rPr>
-            </w:r>
-            <w:r>
-              <w:rPr>
-                <w:sz w:val="20"/>
-                <w:szCs w:val="20"/>
-              </w:rPr>
               <w:fldChar w:fldCharType="separate"/>
             </w:r>
             <w:r>
@@ -3535,10 +3473,6 @@
               <w:t xml:space="preserve"> Git</w:t>
             </w:r>
             <w:r>
-              <w:rPr>
-                <w:sz w:val="20"/>
-                <w:szCs w:val="20"/>
-              </w:rPr>
               <w:fldChar w:fldCharType="end"/>
             </w:r>
             <w:r>
@@ -3856,6 +3790,7 @@
                 <w:szCs w:val="20"/>
               </w:rPr>
             </w:pPr>
+            <w:proofErr w:type="spellStart"/>
             <w:r>
               <w:rPr>
                 <w:b/>
@@ -3865,6 +3800,7 @@
               </w:rPr>
               <w:t>MessageLogger</w:t>
             </w:r>
+            <w:proofErr w:type="spellEnd"/>
             <w:r>
               <w:rPr>
                 <w:sz w:val="20"/>
@@ -3913,30 +3849,12 @@
             </w:r>
             <w:proofErr w:type="spellStart"/>
             <w:r>
-              <w:rPr>
-                <w:sz w:val="20"/>
-                <w:szCs w:val="20"/>
-              </w:rPr>
               <w:fldChar w:fldCharType="begin"/>
             </w:r>
             <w:r>
-              <w:rPr>
-                <w:sz w:val="20"/>
-                <w:szCs w:val="20"/>
-              </w:rPr>
               <w:instrText>HYPERLINK "https://vencord.dev/plugins/MessageLogger?utm_source=chatgpt.com" \o "MessageLogger"</w:instrText>
             </w:r>
             <w:r>
-              <w:rPr>
-                <w:sz w:val="20"/>
-                <w:szCs w:val="20"/>
-              </w:rPr>
-            </w:r>
-            <w:r>
-              <w:rPr>
-                <w:sz w:val="20"/>
-                <w:szCs w:val="20"/>
-              </w:rPr>
               <w:fldChar w:fldCharType="separate"/>
             </w:r>
             <w:r>
@@ -3949,10 +3867,6 @@
             </w:r>
             <w:proofErr w:type="spellEnd"/>
             <w:r>
-              <w:rPr>
-                <w:sz w:val="20"/>
-                <w:szCs w:val="20"/>
-              </w:rPr>
               <w:fldChar w:fldCharType="end"/>
             </w:r>
             <w:r>
@@ -4227,98 +4141,230 @@
     <w:tbl>
       <w:tblPr>
         <w:tblStyle w:val="Table"/>
-        <w:tblW w:w="5000" w:type="pct"/>
-        <w:tblLayout w:type="fixed"/>
-        <w:tblLook w:val="0020" w:firstRow="1" w:lastRow="0" w:firstColumn="0" w:lastColumn="0" w:noHBand="0" w:noVBand="0"/>
+        <w:tblW w:w="10682" w:type="dxa"/>
+        <w:tblBorders>
+          <w:top w:val="single" w:sz="4" w:space="0" w:color="auto"/>
+          <w:left w:val="single" w:sz="4" w:space="0" w:color="auto"/>
+          <w:bottom w:val="single" w:sz="4" w:space="0" w:color="auto"/>
+          <w:right w:val="single" w:sz="4" w:space="0" w:color="auto"/>
+          <w:insideH w:val="single" w:sz="4" w:space="0" w:color="auto"/>
+          <w:insideV w:val="single" w:sz="4" w:space="0" w:color="auto"/>
+        </w:tblBorders>
+        <w:tblLook w:val="04A0" w:firstRow="1" w:lastRow="0" w:firstColumn="1" w:lastColumn="0" w:noHBand="0" w:noVBand="1"/>
       </w:tblPr>
       <w:tblGrid>
-        <w:gridCol w:w="1483"/>
-        <w:gridCol w:w="395"/>
-        <w:gridCol w:w="1781"/>
-        <w:gridCol w:w="3461"/>
-        <w:gridCol w:w="2968"/>
-        <w:gridCol w:w="594"/>
+        <w:gridCol w:w="2237"/>
+        <w:gridCol w:w="480"/>
+        <w:gridCol w:w="2178"/>
+        <w:gridCol w:w="1149"/>
+        <w:gridCol w:w="1422"/>
+        <w:gridCol w:w="3216"/>
       </w:tblGrid>
       <w:tr>
         <w:trPr>
           <w:cnfStyle w:val="100000000000" w:firstRow="1" w:lastRow="0" w:firstColumn="0" w:lastColumn="0" w:oddVBand="0" w:evenVBand="0" w:oddHBand="0" w:evenHBand="0" w:firstRowFirstColumn="0" w:firstRowLastColumn="0" w:lastRowFirstColumn="0" w:lastRowLastColumn="0"/>
-          <w:tblHeader/>
+          <w:trHeight w:val="818"/>
         </w:trPr>
         <w:tc>
           <w:tcPr>
-            <w:tcW w:w="1100" w:type="dxa"/>
-          </w:tcPr>
-          <w:p>
-            <w:pPr>
-              <w:pStyle w:val="Compact"/>
-            </w:pPr>
-            <w:r>
-              <w:t>Artifact Path</w:t>
-            </w:r>
-          </w:p>
-        </w:tc>
-        <w:tc>
-          <w:tcPr>
-            <w:tcW w:w="293" w:type="dxa"/>
-          </w:tcPr>
-          <w:p>
-            <w:pPr>
-              <w:pStyle w:val="Compact"/>
-            </w:pPr>
-            <w:r>
+            <w:tcW w:w="0" w:type="auto"/>
+            <w:tcBorders>
+              <w:bottom w:val="none" w:sz="0" w:space="0" w:color="auto"/>
+            </w:tcBorders>
+            <w:hideMark/>
+          </w:tcPr>
+          <w:p>
+            <w:pPr>
+              <w:spacing w:after="240"/>
+              <w:jc w:val="center"/>
+              <w:rPr>
+                <w:rFonts w:ascii="Segoe UI" w:eastAsia="Times New Roman" w:hAnsi="Segoe UI" w:cs="Segoe UI"/>
+                <w:b/>
+                <w:bCs/>
+                <w:color w:val="000000" w:themeColor="text1"/>
+                <w:sz w:val="20"/>
+                <w:szCs w:val="20"/>
+              </w:rPr>
+            </w:pPr>
+            <w:r>
+              <w:rPr>
+                <w:rFonts w:ascii="Segoe UI" w:eastAsia="Times New Roman" w:hAnsi="Segoe UI" w:cs="Segoe UI"/>
+                <w:b/>
+                <w:bCs/>
+                <w:color w:val="000000" w:themeColor="text1"/>
+                <w:sz w:val="20"/>
+                <w:szCs w:val="20"/>
+              </w:rPr>
+              <w:t>Plugin</w:t>
+            </w:r>
+          </w:p>
+        </w:tc>
+        <w:tc>
+          <w:tcPr>
+            <w:tcW w:w="0" w:type="auto"/>
+            <w:tcBorders>
+              <w:bottom w:val="none" w:sz="0" w:space="0" w:color="auto"/>
+            </w:tcBorders>
+            <w:hideMark/>
+          </w:tcPr>
+          <w:p>
+            <w:pPr>
+              <w:spacing w:after="240"/>
+              <w:jc w:val="center"/>
+              <w:rPr>
+                <w:rFonts w:ascii="Segoe UI" w:eastAsia="Times New Roman" w:hAnsi="Segoe UI" w:cs="Segoe UI"/>
+                <w:b/>
+                <w:bCs/>
+                <w:color w:val="000000" w:themeColor="text1"/>
+                <w:sz w:val="20"/>
+                <w:szCs w:val="20"/>
+              </w:rPr>
+            </w:pPr>
+            <w:r>
+              <w:rPr>
+                <w:rFonts w:ascii="Segoe UI" w:eastAsia="Times New Roman" w:hAnsi="Segoe UI" w:cs="Segoe UI"/>
+                <w:b/>
+                <w:bCs/>
+                <w:color w:val="000000" w:themeColor="text1"/>
+                <w:sz w:val="20"/>
+                <w:szCs w:val="20"/>
+              </w:rPr>
               <w:t>OS</w:t>
             </w:r>
           </w:p>
         </w:tc>
         <w:tc>
           <w:tcPr>
-            <w:tcW w:w="1320" w:type="dxa"/>
-          </w:tcPr>
-          <w:p>
-            <w:pPr>
-              <w:pStyle w:val="Compact"/>
-            </w:pPr>
-            <w:r>
-              <w:t>Observed Content</w:t>
-            </w:r>
-          </w:p>
-        </w:tc>
-        <w:tc>
-          <w:tcPr>
-            <w:tcW w:w="2566" w:type="dxa"/>
-          </w:tcPr>
-          <w:p>
-            <w:pPr>
-              <w:pStyle w:val="Compact"/>
-              <w:jc w:val="right"/>
-            </w:pPr>
-            <w:r>
+            <w:tcW w:w="0" w:type="auto"/>
+            <w:tcBorders>
+              <w:bottom w:val="none" w:sz="0" w:space="0" w:color="auto"/>
+            </w:tcBorders>
+            <w:hideMark/>
+          </w:tcPr>
+          <w:p>
+            <w:pPr>
+              <w:spacing w:after="240"/>
+              <w:jc w:val="center"/>
+              <w:rPr>
+                <w:rFonts w:ascii="Segoe UI" w:eastAsia="Times New Roman" w:hAnsi="Segoe UI" w:cs="Segoe UI"/>
+                <w:b/>
+                <w:bCs/>
+                <w:color w:val="000000" w:themeColor="text1"/>
+                <w:sz w:val="20"/>
+                <w:szCs w:val="20"/>
+              </w:rPr>
+            </w:pPr>
+            <w:r>
+              <w:rPr>
+                <w:rFonts w:ascii="Segoe UI" w:eastAsia="Times New Roman" w:hAnsi="Segoe UI" w:cs="Segoe UI"/>
+                <w:b/>
+                <w:bCs/>
+                <w:color w:val="000000" w:themeColor="text1"/>
+                <w:sz w:val="20"/>
+                <w:szCs w:val="20"/>
+              </w:rPr>
+              <w:t>Persistent method</w:t>
+            </w:r>
+          </w:p>
+        </w:tc>
+        <w:tc>
+          <w:tcPr>
+            <w:tcW w:w="0" w:type="auto"/>
+            <w:tcBorders>
+              <w:bottom w:val="none" w:sz="0" w:space="0" w:color="auto"/>
+            </w:tcBorders>
+            <w:hideMark/>
+          </w:tcPr>
+          <w:p>
+            <w:pPr>
+              <w:spacing w:after="240"/>
+              <w:jc w:val="center"/>
+              <w:rPr>
+                <w:rFonts w:ascii="Segoe UI" w:eastAsia="Times New Roman" w:hAnsi="Segoe UI" w:cs="Segoe UI"/>
+                <w:b/>
+                <w:bCs/>
+                <w:color w:val="000000" w:themeColor="text1"/>
+                <w:sz w:val="20"/>
+                <w:szCs w:val="20"/>
+              </w:rPr>
+            </w:pPr>
+            <w:r>
+              <w:rPr>
+                <w:rFonts w:ascii="Segoe UI" w:eastAsia="Times New Roman" w:hAnsi="Segoe UI" w:cs="Segoe UI"/>
+                <w:b/>
+                <w:bCs/>
+                <w:color w:val="000000" w:themeColor="text1"/>
+                <w:sz w:val="20"/>
+                <w:szCs w:val="20"/>
+              </w:rPr>
               <w:t>Persisted After Deletion? (Y/N)</w:t>
             </w:r>
           </w:p>
         </w:tc>
         <w:tc>
           <w:tcPr>
-            <w:tcW w:w="2200" w:type="dxa"/>
-          </w:tcPr>
-          <w:p>
-            <w:pPr>
-              <w:pStyle w:val="Compact"/>
-            </w:pPr>
-            <w:r>
+            <w:tcW w:w="0" w:type="auto"/>
+            <w:tcBorders>
+              <w:bottom w:val="none" w:sz="0" w:space="0" w:color="auto"/>
+            </w:tcBorders>
+            <w:hideMark/>
+          </w:tcPr>
+          <w:p>
+            <w:pPr>
+              <w:spacing w:after="240"/>
+              <w:jc w:val="center"/>
+              <w:rPr>
+                <w:rFonts w:ascii="Segoe UI" w:eastAsia="Times New Roman" w:hAnsi="Segoe UI" w:cs="Segoe UI"/>
+                <w:b/>
+                <w:bCs/>
+                <w:color w:val="000000" w:themeColor="text1"/>
+                <w:sz w:val="20"/>
+                <w:szCs w:val="20"/>
+              </w:rPr>
+            </w:pPr>
+            <w:r>
+              <w:rPr>
+                <w:rFonts w:ascii="Segoe UI" w:eastAsia="Times New Roman" w:hAnsi="Segoe UI" w:cs="Segoe UI"/>
+                <w:b/>
+                <w:bCs/>
+                <w:color w:val="000000" w:themeColor="text1"/>
+                <w:sz w:val="20"/>
+                <w:szCs w:val="20"/>
+              </w:rPr>
               <w:t>Recovery Method (public ref)</w:t>
             </w:r>
           </w:p>
         </w:tc>
         <w:tc>
           <w:tcPr>
-            <w:tcW w:w="440" w:type="dxa"/>
-          </w:tcPr>
-          <w:p>
-            <w:pPr>
-              <w:pStyle w:val="Compact"/>
-            </w:pPr>
-            <w:r>
+            <w:tcW w:w="0" w:type="auto"/>
+            <w:tcBorders>
+              <w:bottom w:val="none" w:sz="0" w:space="0" w:color="auto"/>
+            </w:tcBorders>
+            <w:hideMark/>
+          </w:tcPr>
+          <w:p>
+            <w:pPr>
+              <w:spacing w:after="240"/>
+              <w:jc w:val="center"/>
+              <w:rPr>
+                <w:rFonts w:ascii="Segoe UI" w:eastAsia="Times New Roman" w:hAnsi="Segoe UI" w:cs="Segoe UI"/>
+                <w:b/>
+                <w:bCs/>
+                <w:color w:val="000000" w:themeColor="text1"/>
+                <w:sz w:val="20"/>
+                <w:szCs w:val="20"/>
+              </w:rPr>
+            </w:pPr>
+            <w:r>
+              <w:rPr>
+                <w:rFonts w:ascii="Segoe UI" w:eastAsia="Times New Roman" w:hAnsi="Segoe UI" w:cs="Segoe UI"/>
+                <w:b/>
+                <w:bCs/>
+                <w:color w:val="000000" w:themeColor="text1"/>
+                <w:sz w:val="20"/>
+                <w:szCs w:val="20"/>
+              </w:rPr>
               <w:t>Notes</w:t>
             </w:r>
           </w:p>
@@ -4327,90 +4373,703 @@
       <w:tr>
         <w:tc>
           <w:tcPr>
-            <w:tcW w:w="1100" w:type="dxa"/>
-          </w:tcPr>
-          <w:p>
-            <w:pPr>
-              <w:pStyle w:val="Compact"/>
-            </w:pPr>
-            <w:r>
-              <w:t xml:space="preserve">e.g., </w:t>
-            </w:r>
-            <w:r>
-              <w:rPr>
-                <w:rStyle w:val="VerbatimChar"/>
-              </w:rPr>
-              <w:t>%AppData%/Discord/Cache/xxx</w:t>
-            </w:r>
-          </w:p>
-        </w:tc>
-        <w:tc>
-          <w:tcPr>
-            <w:tcW w:w="293" w:type="dxa"/>
-          </w:tcPr>
-          <w:p>
-            <w:pPr>
-              <w:pStyle w:val="Compact"/>
-            </w:pPr>
-            <w:r>
-              <w:t>Windows</w:t>
-            </w:r>
-          </w:p>
-        </w:tc>
-        <w:tc>
-          <w:tcPr>
-            <w:tcW w:w="1320" w:type="dxa"/>
-          </w:tcPr>
-          <w:p>
-            <w:pPr>
-              <w:pStyle w:val="Compact"/>
-            </w:pPr>
-            <w:r>
-              <w:t>Partial message fragments</w:t>
-            </w:r>
-          </w:p>
-        </w:tc>
-        <w:tc>
-          <w:tcPr>
-            <w:tcW w:w="2566" w:type="dxa"/>
-          </w:tcPr>
-          <w:p>
-            <w:pPr>
-              <w:pStyle w:val="Compact"/>
-              <w:jc w:val="right"/>
-            </w:pPr>
-            <w:r>
+            <w:tcW w:w="0" w:type="auto"/>
+            <w:hideMark/>
+          </w:tcPr>
+          <w:p>
+            <w:pPr>
+              <w:spacing w:after="240"/>
+              <w:rPr>
+                <w:rFonts w:ascii="Segoe UI" w:eastAsia="Times New Roman" w:hAnsi="Segoe UI" w:cs="Segoe UI"/>
+                <w:color w:val="000000" w:themeColor="text1"/>
+                <w:sz w:val="20"/>
+                <w:szCs w:val="20"/>
+              </w:rPr>
+            </w:pPr>
+            <w:proofErr w:type="spellStart"/>
+            <w:r>
+              <w:rPr>
+                <w:rFonts w:ascii="Segoe UI" w:eastAsia="Times New Roman" w:hAnsi="Segoe UI" w:cs="Segoe UI"/>
+                <w:b/>
+                <w:bCs/>
+                <w:color w:val="000000" w:themeColor="text1"/>
+                <w:sz w:val="20"/>
+                <w:szCs w:val="20"/>
+              </w:rPr>
+              <w:t>MessageLogger</w:t>
+            </w:r>
+            <w:proofErr w:type="spellEnd"/>
+          </w:p>
+        </w:tc>
+        <w:tc>
+          <w:tcPr>
+            <w:tcW w:w="0" w:type="auto"/>
+            <w:hideMark/>
+          </w:tcPr>
+          <w:p>
+            <w:pPr>
+              <w:spacing w:after="240"/>
+              <w:rPr>
+                <w:rFonts w:ascii="Segoe UI" w:eastAsia="Times New Roman" w:hAnsi="Segoe UI" w:cs="Segoe UI"/>
+                <w:color w:val="000000" w:themeColor="text1"/>
+                <w:sz w:val="20"/>
+                <w:szCs w:val="20"/>
+              </w:rPr>
+            </w:pPr>
+            <w:r>
+              <w:rPr>
+                <w:rFonts w:ascii="Segoe UI" w:eastAsia="Times New Roman" w:hAnsi="Segoe UI" w:cs="Segoe UI"/>
+                <w:color w:val="000000" w:themeColor="text1"/>
+                <w:sz w:val="20"/>
+                <w:szCs w:val="20"/>
+              </w:rPr>
+              <w:t>All</w:t>
+            </w:r>
+          </w:p>
+        </w:tc>
+        <w:tc>
+          <w:tcPr>
+            <w:tcW w:w="0" w:type="auto"/>
+            <w:hideMark/>
+          </w:tcPr>
+          <w:p>
+            <w:pPr>
+              <w:spacing w:after="240"/>
+              <w:rPr>
+                <w:rFonts w:ascii="Segoe UI" w:eastAsia="Times New Roman" w:hAnsi="Segoe UI" w:cs="Segoe UI"/>
+                <w:color w:val="000000" w:themeColor="text1"/>
+                <w:sz w:val="20"/>
+                <w:szCs w:val="20"/>
+              </w:rPr>
+            </w:pPr>
+            <w:r>
+              <w:rPr>
+                <w:rFonts w:ascii="Segoe UI" w:eastAsia="Times New Roman" w:hAnsi="Segoe UI" w:cs="Segoe UI"/>
+                <w:color w:val="000000" w:themeColor="text1"/>
+                <w:sz w:val="20"/>
+                <w:szCs w:val="20"/>
+              </w:rPr>
+              <w:t xml:space="preserve">In-memory cache only (Discord </w:t>
+            </w:r>
+            <w:proofErr w:type="spellStart"/>
+            <w:r>
+              <w:rPr>
+                <w:rFonts w:ascii="Segoe UI" w:eastAsia="Times New Roman" w:hAnsi="Segoe UI" w:cs="Segoe UI"/>
+                <w:color w:val="000000" w:themeColor="text1"/>
+                <w:sz w:val="20"/>
+                <w:szCs w:val="20"/>
+              </w:rPr>
+              <w:t>MessageCache</w:t>
+            </w:r>
+            <w:proofErr w:type="spellEnd"/>
+            <w:r>
+              <w:rPr>
+                <w:rFonts w:ascii="Segoe UI" w:eastAsia="Times New Roman" w:hAnsi="Segoe UI" w:cs="Segoe UI"/>
+                <w:color w:val="000000" w:themeColor="text1"/>
+                <w:sz w:val="20"/>
+                <w:szCs w:val="20"/>
+              </w:rPr>
+              <w:t>)</w:t>
+            </w:r>
+          </w:p>
+        </w:tc>
+        <w:tc>
+          <w:tcPr>
+            <w:tcW w:w="0" w:type="auto"/>
+            <w:hideMark/>
+          </w:tcPr>
+          <w:p>
+            <w:pPr>
+              <w:spacing w:after="240"/>
+              <w:rPr>
+                <w:rFonts w:ascii="Segoe UI" w:eastAsia="Times New Roman" w:hAnsi="Segoe UI" w:cs="Segoe UI"/>
+                <w:color w:val="000000" w:themeColor="text1"/>
+                <w:sz w:val="20"/>
+                <w:szCs w:val="20"/>
+              </w:rPr>
+            </w:pPr>
+            <w:r>
+              <w:rPr>
+                <w:rFonts w:ascii="Segoe UI" w:eastAsia="Times New Roman" w:hAnsi="Segoe UI" w:cs="Segoe UI"/>
+                <w:b/>
+                <w:bCs/>
+                <w:color w:val="000000" w:themeColor="text1"/>
+                <w:sz w:val="20"/>
+                <w:szCs w:val="20"/>
+              </w:rPr>
+              <w:t>N</w:t>
+            </w:r>
+          </w:p>
+        </w:tc>
+        <w:tc>
+          <w:tcPr>
+            <w:tcW w:w="0" w:type="auto"/>
+            <w:hideMark/>
+          </w:tcPr>
+          <w:p>
+            <w:pPr>
+              <w:spacing w:after="240"/>
+              <w:rPr>
+                <w:rFonts w:ascii="Segoe UI" w:eastAsia="Times New Roman" w:hAnsi="Segoe UI" w:cs="Segoe UI"/>
+                <w:color w:val="000000" w:themeColor="text1"/>
+                <w:sz w:val="20"/>
+                <w:szCs w:val="20"/>
+              </w:rPr>
+            </w:pPr>
+            <w:r>
+              <w:rPr>
+                <w:rFonts w:ascii="Segoe UI" w:eastAsia="Times New Roman" w:hAnsi="Segoe UI" w:cs="Segoe UI"/>
+                <w:color w:val="000000" w:themeColor="text1"/>
+                <w:sz w:val="20"/>
+                <w:szCs w:val="20"/>
+              </w:rPr>
+              <w:t>Not recoverable - exists in RAM only</w:t>
+            </w:r>
+          </w:p>
+        </w:tc>
+        <w:tc>
+          <w:tcPr>
+            <w:tcW w:w="0" w:type="auto"/>
+            <w:hideMark/>
+          </w:tcPr>
+          <w:p>
+            <w:pPr>
+              <w:spacing w:after="240"/>
+              <w:rPr>
+                <w:rFonts w:ascii="Segoe UI" w:eastAsia="Times New Roman" w:hAnsi="Segoe UI" w:cs="Segoe UI"/>
+                <w:color w:val="000000" w:themeColor="text1"/>
+                <w:sz w:val="20"/>
+                <w:szCs w:val="20"/>
+              </w:rPr>
+            </w:pPr>
+            <w:r>
+              <w:rPr>
+                <w:rFonts w:ascii="Segoe UI" w:eastAsia="Times New Roman" w:hAnsi="Segoe UI" w:cs="Segoe UI"/>
+                <w:color w:val="000000" w:themeColor="text1"/>
+                <w:sz w:val="20"/>
+                <w:szCs w:val="20"/>
+              </w:rPr>
+              <w:t xml:space="preserve">Data stored in Discord's native </w:t>
+            </w:r>
+            <w:proofErr w:type="spellStart"/>
+            <w:r>
+              <w:rPr>
+                <w:rFonts w:ascii="Segoe UI" w:eastAsia="Times New Roman" w:hAnsi="Segoe UI" w:cs="Segoe UI"/>
+                <w:color w:val="000000" w:themeColor="text1"/>
+                <w:sz w:val="20"/>
+                <w:szCs w:val="20"/>
+              </w:rPr>
+              <w:t>MessageCache</w:t>
+            </w:r>
+            <w:proofErr w:type="spellEnd"/>
+            <w:r>
+              <w:rPr>
+                <w:rFonts w:ascii="Segoe UI" w:eastAsia="Times New Roman" w:hAnsi="Segoe UI" w:cs="Segoe UI"/>
+                <w:color w:val="000000" w:themeColor="text1"/>
+                <w:sz w:val="20"/>
+                <w:szCs w:val="20"/>
+              </w:rPr>
+              <w:t>; cleared on reload/restart. No disk persistence.</w:t>
+            </w:r>
+          </w:p>
+        </w:tc>
+      </w:tr>
+      <w:tr>
+        <w:tc>
+          <w:tcPr>
+            <w:tcW w:w="0" w:type="auto"/>
+            <w:hideMark/>
+          </w:tcPr>
+          <w:p>
+            <w:pPr>
+              <w:spacing w:after="240"/>
+              <w:rPr>
+                <w:rFonts w:ascii="Segoe UI" w:eastAsia="Times New Roman" w:hAnsi="Segoe UI" w:cs="Segoe UI"/>
+                <w:color w:val="000000" w:themeColor="text1"/>
+                <w:sz w:val="20"/>
+                <w:szCs w:val="20"/>
+              </w:rPr>
+            </w:pPr>
+            <w:proofErr w:type="spellStart"/>
+            <w:r>
+              <w:rPr>
+                <w:rFonts w:ascii="Segoe UI" w:eastAsia="Times New Roman" w:hAnsi="Segoe UI" w:cs="Segoe UI"/>
+                <w:b/>
+                <w:bCs/>
+                <w:color w:val="000000" w:themeColor="text1"/>
+                <w:sz w:val="20"/>
+                <w:szCs w:val="20"/>
+              </w:rPr>
+              <w:t>AlwaysTrust</w:t>
+            </w:r>
+            <w:proofErr w:type="spellEnd"/>
+          </w:p>
+        </w:tc>
+        <w:tc>
+          <w:tcPr>
+            <w:tcW w:w="0" w:type="auto"/>
+            <w:hideMark/>
+          </w:tcPr>
+          <w:p>
+            <w:pPr>
+              <w:spacing w:after="240"/>
+              <w:rPr>
+                <w:rFonts w:ascii="Segoe UI" w:eastAsia="Times New Roman" w:hAnsi="Segoe UI" w:cs="Segoe UI"/>
+                <w:color w:val="000000" w:themeColor="text1"/>
+                <w:sz w:val="20"/>
+                <w:szCs w:val="20"/>
+              </w:rPr>
+            </w:pPr>
+            <w:r>
+              <w:rPr>
+                <w:rFonts w:ascii="Segoe UI" w:eastAsia="Times New Roman" w:hAnsi="Segoe UI" w:cs="Segoe UI"/>
+                <w:color w:val="000000" w:themeColor="text1"/>
+                <w:sz w:val="20"/>
+                <w:szCs w:val="20"/>
+              </w:rPr>
+              <w:t>All</w:t>
+            </w:r>
+          </w:p>
+        </w:tc>
+        <w:tc>
+          <w:tcPr>
+            <w:tcW w:w="0" w:type="auto"/>
+            <w:hideMark/>
+          </w:tcPr>
+          <w:p>
+            <w:pPr>
+              <w:spacing w:after="240"/>
+              <w:rPr>
+                <w:rFonts w:ascii="Segoe UI" w:eastAsia="Times New Roman" w:hAnsi="Segoe UI" w:cs="Segoe UI"/>
+                <w:color w:val="000000" w:themeColor="text1"/>
+                <w:sz w:val="20"/>
+                <w:szCs w:val="20"/>
+              </w:rPr>
+            </w:pPr>
+            <w:r>
+              <w:rPr>
+                <w:rFonts w:ascii="Segoe UI" w:eastAsia="Times New Roman" w:hAnsi="Segoe UI" w:cs="Segoe UI"/>
+                <w:color w:val="000000" w:themeColor="text1"/>
+                <w:sz w:val="20"/>
+                <w:szCs w:val="20"/>
+              </w:rPr>
+              <w:t xml:space="preserve">Settings in </w:t>
+            </w:r>
+            <w:proofErr w:type="spellStart"/>
+            <w:r>
+              <w:rPr>
+                <w:rFonts w:ascii="Segoe UI" w:eastAsia="Times New Roman" w:hAnsi="Segoe UI" w:cs="Segoe UI"/>
+                <w:color w:val="000000" w:themeColor="text1"/>
+                <w:sz w:val="20"/>
+                <w:szCs w:val="20"/>
+              </w:rPr>
+              <w:t>localStorage</w:t>
+            </w:r>
+            <w:proofErr w:type="spellEnd"/>
+            <w:r>
+              <w:rPr>
+                <w:rFonts w:ascii="Segoe UI" w:eastAsia="Times New Roman" w:hAnsi="Segoe UI" w:cs="Segoe UI"/>
+                <w:color w:val="000000" w:themeColor="text1"/>
+                <w:sz w:val="20"/>
+                <w:szCs w:val="20"/>
+              </w:rPr>
+              <w:t>/</w:t>
+            </w:r>
+            <w:proofErr w:type="spellStart"/>
+            <w:r>
+              <w:rPr>
+                <w:rFonts w:ascii="Segoe UI" w:eastAsia="Times New Roman" w:hAnsi="Segoe UI" w:cs="Segoe UI"/>
+                <w:color w:val="000000" w:themeColor="text1"/>
+                <w:sz w:val="20"/>
+                <w:szCs w:val="20"/>
+              </w:rPr>
+              <w:t>Vencord</w:t>
+            </w:r>
+            <w:proofErr w:type="spellEnd"/>
+            <w:r>
+              <w:rPr>
+                <w:rFonts w:ascii="Segoe UI" w:eastAsia="Times New Roman" w:hAnsi="Segoe UI" w:cs="Segoe UI"/>
+                <w:color w:val="000000" w:themeColor="text1"/>
+                <w:sz w:val="20"/>
+                <w:szCs w:val="20"/>
+              </w:rPr>
+              <w:t xml:space="preserve"> settings file</w:t>
+            </w:r>
+          </w:p>
+        </w:tc>
+        <w:tc>
+          <w:tcPr>
+            <w:tcW w:w="0" w:type="auto"/>
+            <w:hideMark/>
+          </w:tcPr>
+          <w:p>
+            <w:pPr>
+              <w:spacing w:after="240"/>
+              <w:rPr>
+                <w:rFonts w:ascii="Segoe UI" w:eastAsia="Times New Roman" w:hAnsi="Segoe UI" w:cs="Segoe UI"/>
+                <w:color w:val="000000" w:themeColor="text1"/>
+                <w:sz w:val="20"/>
+                <w:szCs w:val="20"/>
+              </w:rPr>
+            </w:pPr>
+            <w:r>
+              <w:rPr>
+                <w:rFonts w:ascii="Segoe UI" w:eastAsia="Times New Roman" w:hAnsi="Segoe UI" w:cs="Segoe UI"/>
+                <w:b/>
+                <w:bCs/>
+                <w:color w:val="000000" w:themeColor="text1"/>
+                <w:sz w:val="20"/>
+                <w:szCs w:val="20"/>
+              </w:rPr>
               <w:t>Y</w:t>
             </w:r>
           </w:p>
         </w:tc>
         <w:tc>
           <w:tcPr>
-            <w:tcW w:w="2200" w:type="dxa"/>
-          </w:tcPr>
-          <w:p>
-            <w:pPr>
-              <w:pStyle w:val="Compact"/>
-            </w:pPr>
-            <w:r>
-              <w:t>DFIR blog post 2022</w:t>
-            </w:r>
-          </w:p>
-        </w:tc>
-        <w:tc>
-          <w:tcPr>
-            <w:tcW w:w="440" w:type="dxa"/>
-          </w:tcPr>
-          <w:p>
-            <w:pPr>
-              <w:pStyle w:val="Compact"/>
-            </w:pPr>
-            <w:r>
-              <w:t>timestamps retain me</w:t>
-            </w:r>
-            <w:r>
+            <w:tcW w:w="0" w:type="auto"/>
+            <w:hideMark/>
+          </w:tcPr>
+          <w:p>
+            <w:pPr>
+              <w:spacing w:after="240"/>
+              <w:rPr>
+                <w:rFonts w:ascii="Segoe UI" w:eastAsia="Times New Roman" w:hAnsi="Segoe UI" w:cs="Segoe UI"/>
+                <w:color w:val="000000" w:themeColor="text1"/>
+                <w:sz w:val="20"/>
+                <w:szCs w:val="20"/>
+              </w:rPr>
+            </w:pPr>
+            <w:r>
+              <w:rPr>
+                <w:rFonts w:ascii="Segoe UI" w:eastAsia="Times New Roman" w:hAnsi="Segoe UI" w:cs="Segoe UI"/>
+                <w:color w:val="000000" w:themeColor="text1"/>
+                <w:sz w:val="20"/>
+                <w:szCs w:val="20"/>
+              </w:rPr>
+              <w:t xml:space="preserve">Standard browser </w:t>
+            </w:r>
+            <w:proofErr w:type="spellStart"/>
+            <w:r>
+              <w:rPr>
+                <w:rFonts w:ascii="Segoe UI" w:eastAsia="Times New Roman" w:hAnsi="Segoe UI" w:cs="Segoe UI"/>
+                <w:color w:val="000000" w:themeColor="text1"/>
+                <w:sz w:val="20"/>
+                <w:szCs w:val="20"/>
+              </w:rPr>
+              <w:t>localStorage</w:t>
+            </w:r>
+            <w:proofErr w:type="spellEnd"/>
+            <w:r>
+              <w:rPr>
+                <w:rFonts w:ascii="Segoe UI" w:eastAsia="Times New Roman" w:hAnsi="Segoe UI" w:cs="Segoe UI"/>
+                <w:color w:val="000000" w:themeColor="text1"/>
+                <w:sz w:val="20"/>
+                <w:szCs w:val="20"/>
+              </w:rPr>
+              <w:t xml:space="preserve"> recovery or </w:t>
+            </w:r>
+            <w:proofErr w:type="spellStart"/>
+            <w:r>
+              <w:rPr>
+                <w:rFonts w:ascii="Segoe UI" w:eastAsia="Times New Roman" w:hAnsi="Segoe UI" w:cs="Segoe UI"/>
+                <w:color w:val="000000" w:themeColor="text1"/>
+                <w:sz w:val="20"/>
+                <w:szCs w:val="20"/>
+              </w:rPr>
+              <w:t>Vencord</w:t>
+            </w:r>
+            <w:proofErr w:type="spellEnd"/>
+            <w:r>
+              <w:rPr>
+                <w:rFonts w:ascii="Segoe UI" w:eastAsia="Times New Roman" w:hAnsi="Segoe UI" w:cs="Segoe UI"/>
+                <w:color w:val="000000" w:themeColor="text1"/>
+                <w:sz w:val="20"/>
+                <w:szCs w:val="20"/>
+              </w:rPr>
+              <w:t xml:space="preserve"> </w:t>
+            </w:r>
+            <w:r>
+              <w:rPr>
+                <w:rFonts w:ascii="Segoe UI" w:eastAsia="Times New Roman" w:hAnsi="Segoe UI" w:cs="Segoe UI"/>
+                <w:color w:val="000000" w:themeColor="text1"/>
+                <w:sz w:val="20"/>
+                <w:szCs w:val="20"/>
+              </w:rPr>
               <w:lastRenderedPageBreak/>
-              <w:t>ssage index</w:t>
+              <w:t>settings backup</w:t>
+            </w:r>
+          </w:p>
+        </w:tc>
+        <w:tc>
+          <w:tcPr>
+            <w:tcW w:w="0" w:type="auto"/>
+            <w:hideMark/>
+          </w:tcPr>
+          <w:p>
+            <w:pPr>
+              <w:spacing w:after="240"/>
+              <w:rPr>
+                <w:rFonts w:ascii="Segoe UI" w:eastAsia="Times New Roman" w:hAnsi="Segoe UI" w:cs="Segoe UI"/>
+                <w:color w:val="000000" w:themeColor="text1"/>
+                <w:sz w:val="20"/>
+                <w:szCs w:val="20"/>
+              </w:rPr>
+            </w:pPr>
+            <w:r>
+              <w:rPr>
+                <w:rFonts w:ascii="Segoe UI" w:eastAsia="Times New Roman" w:hAnsi="Segoe UI" w:cs="Segoe UI"/>
+                <w:color w:val="000000" w:themeColor="text1"/>
+                <w:sz w:val="20"/>
+                <w:szCs w:val="20"/>
+              </w:rPr>
+              <w:lastRenderedPageBreak/>
+              <w:t>Only stores plugin enabled/disabled state and config. No message/link data stored.</w:t>
+            </w:r>
+          </w:p>
+        </w:tc>
+      </w:tr>
+      <w:tr>
+        <w:tc>
+          <w:tcPr>
+            <w:tcW w:w="0" w:type="auto"/>
+            <w:hideMark/>
+          </w:tcPr>
+          <w:p>
+            <w:pPr>
+              <w:spacing w:after="240"/>
+              <w:rPr>
+                <w:rFonts w:ascii="Segoe UI" w:eastAsia="Times New Roman" w:hAnsi="Segoe UI" w:cs="Segoe UI"/>
+                <w:color w:val="000000" w:themeColor="text1"/>
+                <w:sz w:val="20"/>
+                <w:szCs w:val="20"/>
+              </w:rPr>
+            </w:pPr>
+            <w:proofErr w:type="spellStart"/>
+            <w:r>
+              <w:rPr>
+                <w:rFonts w:ascii="Segoe UI" w:eastAsia="Times New Roman" w:hAnsi="Segoe UI" w:cs="Segoe UI"/>
+                <w:b/>
+                <w:bCs/>
+                <w:color w:val="000000" w:themeColor="text1"/>
+                <w:sz w:val="20"/>
+                <w:szCs w:val="20"/>
+              </w:rPr>
+              <w:lastRenderedPageBreak/>
+              <w:t>AnonymiseFileNames</w:t>
+            </w:r>
+            <w:proofErr w:type="spellEnd"/>
+          </w:p>
+        </w:tc>
+        <w:tc>
+          <w:tcPr>
+            <w:tcW w:w="0" w:type="auto"/>
+            <w:hideMark/>
+          </w:tcPr>
+          <w:p>
+            <w:pPr>
+              <w:spacing w:after="240"/>
+              <w:rPr>
+                <w:rFonts w:ascii="Segoe UI" w:eastAsia="Times New Roman" w:hAnsi="Segoe UI" w:cs="Segoe UI"/>
+                <w:color w:val="000000" w:themeColor="text1"/>
+                <w:sz w:val="20"/>
+                <w:szCs w:val="20"/>
+              </w:rPr>
+            </w:pPr>
+            <w:r>
+              <w:rPr>
+                <w:rFonts w:ascii="Segoe UI" w:eastAsia="Times New Roman" w:hAnsi="Segoe UI" w:cs="Segoe UI"/>
+                <w:color w:val="000000" w:themeColor="text1"/>
+                <w:sz w:val="20"/>
+                <w:szCs w:val="20"/>
+              </w:rPr>
+              <w:t>All</w:t>
+            </w:r>
+          </w:p>
+        </w:tc>
+        <w:tc>
+          <w:tcPr>
+            <w:tcW w:w="0" w:type="auto"/>
+            <w:hideMark/>
+          </w:tcPr>
+          <w:p>
+            <w:pPr>
+              <w:spacing w:after="240"/>
+              <w:rPr>
+                <w:rFonts w:ascii="Segoe UI" w:eastAsia="Times New Roman" w:hAnsi="Segoe UI" w:cs="Segoe UI"/>
+                <w:color w:val="000000" w:themeColor="text1"/>
+                <w:sz w:val="20"/>
+                <w:szCs w:val="20"/>
+              </w:rPr>
+            </w:pPr>
+            <w:r>
+              <w:rPr>
+                <w:rFonts w:ascii="Segoe UI" w:eastAsia="Times New Roman" w:hAnsi="Segoe UI" w:cs="Segoe UI"/>
+                <w:color w:val="000000" w:themeColor="text1"/>
+                <w:sz w:val="20"/>
+                <w:szCs w:val="20"/>
+              </w:rPr>
+              <w:t xml:space="preserve">Settings in </w:t>
+            </w:r>
+            <w:proofErr w:type="spellStart"/>
+            <w:r>
+              <w:rPr>
+                <w:rFonts w:ascii="Segoe UI" w:eastAsia="Times New Roman" w:hAnsi="Segoe UI" w:cs="Segoe UI"/>
+                <w:color w:val="000000" w:themeColor="text1"/>
+                <w:sz w:val="20"/>
+                <w:szCs w:val="20"/>
+              </w:rPr>
+              <w:t>localStorage</w:t>
+            </w:r>
+            <w:proofErr w:type="spellEnd"/>
+            <w:r>
+              <w:rPr>
+                <w:rFonts w:ascii="Segoe UI" w:eastAsia="Times New Roman" w:hAnsi="Segoe UI" w:cs="Segoe UI"/>
+                <w:color w:val="000000" w:themeColor="text1"/>
+                <w:sz w:val="20"/>
+                <w:szCs w:val="20"/>
+              </w:rPr>
+              <w:t>/</w:t>
+            </w:r>
+            <w:proofErr w:type="spellStart"/>
+            <w:r>
+              <w:rPr>
+                <w:rFonts w:ascii="Segoe UI" w:eastAsia="Times New Roman" w:hAnsi="Segoe UI" w:cs="Segoe UI"/>
+                <w:color w:val="000000" w:themeColor="text1"/>
+                <w:sz w:val="20"/>
+                <w:szCs w:val="20"/>
+              </w:rPr>
+              <w:t>Vencord</w:t>
+            </w:r>
+            <w:proofErr w:type="spellEnd"/>
+            <w:r>
+              <w:rPr>
+                <w:rFonts w:ascii="Segoe UI" w:eastAsia="Times New Roman" w:hAnsi="Segoe UI" w:cs="Segoe UI"/>
+                <w:color w:val="000000" w:themeColor="text1"/>
+                <w:sz w:val="20"/>
+                <w:szCs w:val="20"/>
+              </w:rPr>
+              <w:t xml:space="preserve"> settings file</w:t>
+            </w:r>
+          </w:p>
+        </w:tc>
+        <w:tc>
+          <w:tcPr>
+            <w:tcW w:w="0" w:type="auto"/>
+            <w:hideMark/>
+          </w:tcPr>
+          <w:p>
+            <w:pPr>
+              <w:spacing w:after="240"/>
+              <w:rPr>
+                <w:rFonts w:ascii="Segoe UI" w:eastAsia="Times New Roman" w:hAnsi="Segoe UI" w:cs="Segoe UI"/>
+                <w:color w:val="000000" w:themeColor="text1"/>
+                <w:sz w:val="20"/>
+                <w:szCs w:val="20"/>
+              </w:rPr>
+            </w:pPr>
+            <w:r>
+              <w:rPr>
+                <w:rFonts w:ascii="Segoe UI" w:eastAsia="Times New Roman" w:hAnsi="Segoe UI" w:cs="Segoe UI"/>
+                <w:b/>
+                <w:bCs/>
+                <w:color w:val="000000" w:themeColor="text1"/>
+                <w:sz w:val="20"/>
+                <w:szCs w:val="20"/>
+              </w:rPr>
+              <w:t>Y</w:t>
+            </w:r>
+          </w:p>
+        </w:tc>
+        <w:tc>
+          <w:tcPr>
+            <w:tcW w:w="0" w:type="auto"/>
+            <w:hideMark/>
+          </w:tcPr>
+          <w:p>
+            <w:pPr>
+              <w:spacing w:after="240"/>
+              <w:rPr>
+                <w:rFonts w:ascii="Segoe UI" w:eastAsia="Times New Roman" w:hAnsi="Segoe UI" w:cs="Segoe UI"/>
+                <w:color w:val="000000" w:themeColor="text1"/>
+                <w:sz w:val="20"/>
+                <w:szCs w:val="20"/>
+              </w:rPr>
+            </w:pPr>
+            <w:r>
+              <w:rPr>
+                <w:rFonts w:ascii="Segoe UI" w:eastAsia="Times New Roman" w:hAnsi="Segoe UI" w:cs="Segoe UI"/>
+                <w:color w:val="000000" w:themeColor="text1"/>
+                <w:sz w:val="20"/>
+                <w:szCs w:val="20"/>
+              </w:rPr>
+              <w:t xml:space="preserve">Standard browser </w:t>
+            </w:r>
+            <w:proofErr w:type="spellStart"/>
+            <w:r>
+              <w:rPr>
+                <w:rFonts w:ascii="Segoe UI" w:eastAsia="Times New Roman" w:hAnsi="Segoe UI" w:cs="Segoe UI"/>
+                <w:color w:val="000000" w:themeColor="text1"/>
+                <w:sz w:val="20"/>
+                <w:szCs w:val="20"/>
+              </w:rPr>
+              <w:t>localStorage</w:t>
+            </w:r>
+            <w:proofErr w:type="spellEnd"/>
+            <w:r>
+              <w:rPr>
+                <w:rFonts w:ascii="Segoe UI" w:eastAsia="Times New Roman" w:hAnsi="Segoe UI" w:cs="Segoe UI"/>
+                <w:color w:val="000000" w:themeColor="text1"/>
+                <w:sz w:val="20"/>
+                <w:szCs w:val="20"/>
+              </w:rPr>
+              <w:t xml:space="preserve"> recovery or </w:t>
+            </w:r>
+            <w:proofErr w:type="spellStart"/>
+            <w:r>
+              <w:rPr>
+                <w:rFonts w:ascii="Segoe UI" w:eastAsia="Times New Roman" w:hAnsi="Segoe UI" w:cs="Segoe UI"/>
+                <w:color w:val="000000" w:themeColor="text1"/>
+                <w:sz w:val="20"/>
+                <w:szCs w:val="20"/>
+              </w:rPr>
+              <w:t>Vencord</w:t>
+            </w:r>
+            <w:proofErr w:type="spellEnd"/>
+            <w:r>
+              <w:rPr>
+                <w:rFonts w:ascii="Segoe UI" w:eastAsia="Times New Roman" w:hAnsi="Segoe UI" w:cs="Segoe UI"/>
+                <w:color w:val="000000" w:themeColor="text1"/>
+                <w:sz w:val="20"/>
+                <w:szCs w:val="20"/>
+              </w:rPr>
+              <w:t xml:space="preserve"> settings backup</w:t>
+            </w:r>
+          </w:p>
+        </w:tc>
+        <w:tc>
+          <w:tcPr>
+            <w:tcW w:w="0" w:type="auto"/>
+            <w:hideMark/>
+          </w:tcPr>
+          <w:p>
+            <w:pPr>
+              <w:spacing w:after="240"/>
+              <w:rPr>
+                <w:rFonts w:ascii="Segoe UI" w:eastAsia="Times New Roman" w:hAnsi="Segoe UI" w:cs="Segoe UI"/>
+                <w:color w:val="000000" w:themeColor="text1"/>
+                <w:sz w:val="20"/>
+                <w:szCs w:val="20"/>
+              </w:rPr>
+            </w:pPr>
+            <w:r>
+              <w:rPr>
+                <w:rFonts w:ascii="Segoe UI" w:eastAsia="Times New Roman" w:hAnsi="Segoe UI" w:cs="Segoe UI"/>
+                <w:color w:val="000000" w:themeColor="text1"/>
+                <w:sz w:val="20"/>
+                <w:szCs w:val="20"/>
+              </w:rPr>
+              <w:t>Only stores anonymization method settings (random/consistent/timestamp). Original filenames never logged.</w:t>
             </w:r>
           </w:p>
         </w:tc>
@@ -4419,42 +5078,2236 @@
     <w:p>
       <w:pPr>
         <w:pStyle w:val="BodyText"/>
-      </w:pPr>
-      <w:r>
         <w:rPr>
           <w:b/>
           <w:bCs/>
         </w:rPr>
-        <w:lastRenderedPageBreak/>
-        <w:t>Sandbox checklist</w:t>
-      </w:r>
-      <w:r>
-        <w:t xml:space="preserve"> - OS &amp; client version used:</w:t>
-      </w:r>
-      <w:r>
-        <w:br/>
-        <w:t>- Dummy account IDs (anonymized labels):</w:t>
-      </w:r>
-      <w:r>
-        <w:br/>
-        <w:t>- Steps performed (send msg → delete → inspect cache):</w:t>
-      </w:r>
-      <w:r>
-        <w:br/>
-        <w:t>- Tools used (File Explorer, Wireshark passive capture, etc.):</w:t>
-      </w:r>
-      <w:r>
-        <w:br/>
-        <w:t>- Screenshot references (stored locally) — label each screenshot:</w:t>
-      </w:r>
+      </w:pPr>
     </w:p>
-    <w:p>
-      <w:r>
-        <w:pict w14:anchorId="5849DBA3">
-          <v:rect id="_x0000_i1031" style="width:0;height:1.5pt" o:hralign="center" o:hrstd="t" o:hr="t"/>
-        </w:pict>
-      </w:r>
-    </w:p>
+    <w:tbl>
+      <w:tblPr>
+        <w:tblW w:w="9834" w:type="dxa"/>
+        <w:tblBorders>
+          <w:top w:val="single" w:sz="4" w:space="0" w:color="auto"/>
+          <w:left w:val="single" w:sz="4" w:space="0" w:color="auto"/>
+          <w:bottom w:val="single" w:sz="4" w:space="0" w:color="auto"/>
+          <w:right w:val="single" w:sz="4" w:space="0" w:color="auto"/>
+        </w:tblBorders>
+        <w:shd w:val="clear" w:color="auto" w:fill="32374D"/>
+        <w:tblCellMar>
+          <w:top w:w="60" w:type="dxa"/>
+          <w:left w:w="90" w:type="dxa"/>
+          <w:bottom w:w="60" w:type="dxa"/>
+          <w:right w:w="90" w:type="dxa"/>
+        </w:tblCellMar>
+        <w:tblLook w:val="04A0" w:firstRow="1" w:lastRow="0" w:firstColumn="1" w:lastColumn="0" w:noHBand="0" w:noVBand="1"/>
+      </w:tblPr>
+      <w:tblGrid>
+        <w:gridCol w:w="2107"/>
+        <w:gridCol w:w="766"/>
+        <w:gridCol w:w="4892"/>
+        <w:gridCol w:w="820"/>
+        <w:gridCol w:w="871"/>
+        <w:gridCol w:w="1190"/>
+      </w:tblGrid>
+      <w:tr>
+        <w:trPr>
+          <w:trHeight w:val="1300"/>
+          <w:tblHeader/>
+        </w:trPr>
+        <w:tc>
+          <w:tcPr>
+            <w:tcW w:w="0" w:type="auto"/>
+            <w:tcBorders>
+              <w:top w:val="single" w:sz="4" w:space="0" w:color="auto"/>
+              <w:left w:val="single" w:sz="4" w:space="0" w:color="auto"/>
+              <w:bottom w:val="single" w:sz="4" w:space="0" w:color="auto"/>
+              <w:right w:val="single" w:sz="4" w:space="0" w:color="auto"/>
+            </w:tcBorders>
+            <w:shd w:val="clear" w:color="auto" w:fill="32374D"/>
+            <w:vAlign w:val="center"/>
+            <w:hideMark/>
+          </w:tcPr>
+          <w:p>
+            <w:pPr>
+              <w:spacing w:after="240"/>
+              <w:jc w:val="center"/>
+              <w:rPr>
+                <w:rFonts w:ascii="Segoe UI" w:eastAsia="Times New Roman" w:hAnsi="Segoe UI" w:cs="Segoe UI"/>
+                <w:b/>
+                <w:bCs/>
+                <w:color w:val="DEDEDE"/>
+                <w:sz w:val="20"/>
+                <w:szCs w:val="20"/>
+              </w:rPr>
+            </w:pPr>
+            <w:r>
+              <w:rPr>
+                <w:rFonts w:ascii="Segoe UI" w:eastAsia="Times New Roman" w:hAnsi="Segoe UI" w:cs="Segoe UI"/>
+                <w:b/>
+                <w:bCs/>
+                <w:color w:val="DEDEDE"/>
+                <w:sz w:val="20"/>
+                <w:szCs w:val="20"/>
+              </w:rPr>
+              <w:t>Artifact Path</w:t>
+            </w:r>
+          </w:p>
+        </w:tc>
+        <w:tc>
+          <w:tcPr>
+            <w:tcW w:w="0" w:type="auto"/>
+            <w:tcBorders>
+              <w:top w:val="single" w:sz="4" w:space="0" w:color="auto"/>
+              <w:left w:val="single" w:sz="4" w:space="0" w:color="auto"/>
+              <w:bottom w:val="single" w:sz="4" w:space="0" w:color="auto"/>
+              <w:right w:val="single" w:sz="4" w:space="0" w:color="auto"/>
+            </w:tcBorders>
+            <w:shd w:val="clear" w:color="auto" w:fill="32374D"/>
+            <w:vAlign w:val="center"/>
+            <w:hideMark/>
+          </w:tcPr>
+          <w:p>
+            <w:pPr>
+              <w:spacing w:after="240"/>
+              <w:jc w:val="center"/>
+              <w:rPr>
+                <w:rFonts w:ascii="Segoe UI" w:eastAsia="Times New Roman" w:hAnsi="Segoe UI" w:cs="Segoe UI"/>
+                <w:b/>
+                <w:bCs/>
+                <w:color w:val="DEDEDE"/>
+                <w:sz w:val="20"/>
+                <w:szCs w:val="20"/>
+              </w:rPr>
+            </w:pPr>
+            <w:r>
+              <w:rPr>
+                <w:rFonts w:ascii="Segoe UI" w:eastAsia="Times New Roman" w:hAnsi="Segoe UI" w:cs="Segoe UI"/>
+                <w:b/>
+                <w:bCs/>
+                <w:color w:val="DEDEDE"/>
+                <w:sz w:val="20"/>
+                <w:szCs w:val="20"/>
+              </w:rPr>
+              <w:t>OS</w:t>
+            </w:r>
+          </w:p>
+        </w:tc>
+        <w:tc>
+          <w:tcPr>
+            <w:tcW w:w="0" w:type="auto"/>
+            <w:tcBorders>
+              <w:top w:val="single" w:sz="4" w:space="0" w:color="auto"/>
+              <w:left w:val="single" w:sz="4" w:space="0" w:color="auto"/>
+              <w:bottom w:val="single" w:sz="4" w:space="0" w:color="auto"/>
+              <w:right w:val="single" w:sz="4" w:space="0" w:color="auto"/>
+            </w:tcBorders>
+            <w:shd w:val="clear" w:color="auto" w:fill="32374D"/>
+            <w:vAlign w:val="center"/>
+            <w:hideMark/>
+          </w:tcPr>
+          <w:p>
+            <w:pPr>
+              <w:spacing w:after="240"/>
+              <w:jc w:val="center"/>
+              <w:rPr>
+                <w:rFonts w:ascii="Segoe UI" w:eastAsia="Times New Roman" w:hAnsi="Segoe UI" w:cs="Segoe UI"/>
+                <w:b/>
+                <w:bCs/>
+                <w:color w:val="DEDEDE"/>
+                <w:sz w:val="20"/>
+                <w:szCs w:val="20"/>
+              </w:rPr>
+            </w:pPr>
+            <w:r>
+              <w:rPr>
+                <w:rFonts w:ascii="Segoe UI" w:eastAsia="Times New Roman" w:hAnsi="Segoe UI" w:cs="Segoe UI"/>
+                <w:b/>
+                <w:bCs/>
+                <w:color w:val="DEDEDE"/>
+                <w:sz w:val="20"/>
+                <w:szCs w:val="20"/>
+              </w:rPr>
+              <w:t>Observed Content</w:t>
+            </w:r>
+          </w:p>
+        </w:tc>
+        <w:tc>
+          <w:tcPr>
+            <w:tcW w:w="0" w:type="auto"/>
+            <w:tcBorders>
+              <w:top w:val="single" w:sz="4" w:space="0" w:color="auto"/>
+              <w:left w:val="single" w:sz="4" w:space="0" w:color="auto"/>
+              <w:bottom w:val="single" w:sz="4" w:space="0" w:color="auto"/>
+              <w:right w:val="single" w:sz="4" w:space="0" w:color="auto"/>
+            </w:tcBorders>
+            <w:shd w:val="clear" w:color="auto" w:fill="32374D"/>
+            <w:vAlign w:val="center"/>
+            <w:hideMark/>
+          </w:tcPr>
+          <w:p>
+            <w:pPr>
+              <w:spacing w:after="240"/>
+              <w:jc w:val="center"/>
+              <w:rPr>
+                <w:rFonts w:ascii="Segoe UI" w:eastAsia="Times New Roman" w:hAnsi="Segoe UI" w:cs="Segoe UI"/>
+                <w:b/>
+                <w:bCs/>
+                <w:color w:val="DEDEDE"/>
+                <w:sz w:val="20"/>
+                <w:szCs w:val="20"/>
+              </w:rPr>
+            </w:pPr>
+            <w:r>
+              <w:rPr>
+                <w:rFonts w:ascii="Segoe UI" w:eastAsia="Times New Roman" w:hAnsi="Segoe UI" w:cs="Segoe UI"/>
+                <w:b/>
+                <w:bCs/>
+                <w:color w:val="DEDEDE"/>
+                <w:sz w:val="20"/>
+                <w:szCs w:val="20"/>
+              </w:rPr>
+              <w:t>Persisted After Deletion? (Y/N)</w:t>
+            </w:r>
+          </w:p>
+        </w:tc>
+        <w:tc>
+          <w:tcPr>
+            <w:tcW w:w="0" w:type="auto"/>
+            <w:tcBorders>
+              <w:top w:val="single" w:sz="4" w:space="0" w:color="auto"/>
+              <w:left w:val="single" w:sz="4" w:space="0" w:color="auto"/>
+              <w:bottom w:val="single" w:sz="4" w:space="0" w:color="auto"/>
+              <w:right w:val="single" w:sz="4" w:space="0" w:color="auto"/>
+            </w:tcBorders>
+            <w:shd w:val="clear" w:color="auto" w:fill="32374D"/>
+            <w:vAlign w:val="center"/>
+            <w:hideMark/>
+          </w:tcPr>
+          <w:p>
+            <w:pPr>
+              <w:spacing w:after="240"/>
+              <w:jc w:val="center"/>
+              <w:rPr>
+                <w:rFonts w:ascii="Segoe UI" w:eastAsia="Times New Roman" w:hAnsi="Segoe UI" w:cs="Segoe UI"/>
+                <w:b/>
+                <w:bCs/>
+                <w:color w:val="DEDEDE"/>
+                <w:sz w:val="20"/>
+                <w:szCs w:val="20"/>
+              </w:rPr>
+            </w:pPr>
+            <w:r>
+              <w:rPr>
+                <w:rFonts w:ascii="Segoe UI" w:eastAsia="Times New Roman" w:hAnsi="Segoe UI" w:cs="Segoe UI"/>
+                <w:b/>
+                <w:bCs/>
+                <w:color w:val="DEDEDE"/>
+                <w:sz w:val="20"/>
+                <w:szCs w:val="20"/>
+              </w:rPr>
+              <w:t>Recovery Method (public ref)</w:t>
+            </w:r>
+          </w:p>
+        </w:tc>
+        <w:tc>
+          <w:tcPr>
+            <w:tcW w:w="0" w:type="auto"/>
+            <w:tcBorders>
+              <w:top w:val="single" w:sz="4" w:space="0" w:color="auto"/>
+              <w:left w:val="single" w:sz="4" w:space="0" w:color="auto"/>
+              <w:bottom w:val="single" w:sz="4" w:space="0" w:color="auto"/>
+              <w:right w:val="single" w:sz="4" w:space="0" w:color="auto"/>
+            </w:tcBorders>
+            <w:shd w:val="clear" w:color="auto" w:fill="32374D"/>
+            <w:vAlign w:val="center"/>
+            <w:hideMark/>
+          </w:tcPr>
+          <w:p>
+            <w:pPr>
+              <w:spacing w:after="240"/>
+              <w:jc w:val="center"/>
+              <w:rPr>
+                <w:rFonts w:ascii="Segoe UI" w:eastAsia="Times New Roman" w:hAnsi="Segoe UI" w:cs="Segoe UI"/>
+                <w:b/>
+                <w:bCs/>
+                <w:color w:val="DEDEDE"/>
+                <w:sz w:val="20"/>
+                <w:szCs w:val="20"/>
+              </w:rPr>
+            </w:pPr>
+            <w:r>
+              <w:rPr>
+                <w:rFonts w:ascii="Segoe UI" w:eastAsia="Times New Roman" w:hAnsi="Segoe UI" w:cs="Segoe UI"/>
+                <w:b/>
+                <w:bCs/>
+                <w:color w:val="DEDEDE"/>
+                <w:sz w:val="20"/>
+                <w:szCs w:val="20"/>
+              </w:rPr>
+              <w:t>Notes</w:t>
+            </w:r>
+          </w:p>
+        </w:tc>
+      </w:tr>
+      <w:tr>
+        <w:trPr>
+          <w:trHeight w:val="1840"/>
+        </w:trPr>
+        <w:tc>
+          <w:tcPr>
+            <w:tcW w:w="0" w:type="auto"/>
+            <w:tcBorders>
+              <w:top w:val="single" w:sz="4" w:space="0" w:color="auto"/>
+              <w:left w:val="single" w:sz="4" w:space="0" w:color="auto"/>
+              <w:bottom w:val="single" w:sz="4" w:space="0" w:color="auto"/>
+              <w:right w:val="single" w:sz="4" w:space="0" w:color="auto"/>
+            </w:tcBorders>
+            <w:shd w:val="clear" w:color="auto" w:fill="32374D"/>
+            <w:vAlign w:val="center"/>
+            <w:hideMark/>
+          </w:tcPr>
+          <w:p>
+            <w:pPr>
+              <w:spacing w:after="240"/>
+              <w:rPr>
+                <w:rFonts w:ascii="Segoe UI" w:eastAsia="Times New Roman" w:hAnsi="Segoe UI" w:cs="Segoe UI"/>
+                <w:color w:val="DEDEDE"/>
+                <w:sz w:val="20"/>
+                <w:szCs w:val="20"/>
+              </w:rPr>
+            </w:pPr>
+            <w:proofErr w:type="spellStart"/>
+            <w:r>
+              <w:rPr>
+                <w:rFonts w:ascii="Segoe UI" w:eastAsia="Times New Roman" w:hAnsi="Segoe UI" w:cs="Segoe UI"/>
+                <w:b/>
+                <w:bCs/>
+                <w:color w:val="DEDEDE"/>
+              </w:rPr>
+              <w:t>IndexedDB</w:t>
+            </w:r>
+            <w:proofErr w:type="spellEnd"/>
+            <w:r>
+              <w:rPr>
+                <w:rFonts w:ascii="Segoe UI" w:eastAsia="Times New Roman" w:hAnsi="Segoe UI" w:cs="Segoe UI"/>
+                <w:b/>
+                <w:bCs/>
+                <w:color w:val="DEDEDE"/>
+              </w:rPr>
+              <w:t xml:space="preserve"> (</w:t>
+            </w:r>
+            <w:proofErr w:type="spellStart"/>
+            <w:r>
+              <w:rPr>
+                <w:rFonts w:ascii="Segoe UI" w:eastAsia="Times New Roman" w:hAnsi="Segoe UI" w:cs="Segoe UI"/>
+                <w:b/>
+                <w:bCs/>
+                <w:color w:val="DEDEDE"/>
+              </w:rPr>
+              <w:t>VencordData</w:t>
+            </w:r>
+            <w:proofErr w:type="spellEnd"/>
+            <w:r>
+              <w:rPr>
+                <w:rFonts w:ascii="Segoe UI" w:eastAsia="Times New Roman" w:hAnsi="Segoe UI" w:cs="Segoe UI"/>
+                <w:b/>
+                <w:bCs/>
+                <w:color w:val="DEDEDE"/>
+              </w:rPr>
+              <w:t>)</w:t>
+            </w:r>
+          </w:p>
+        </w:tc>
+        <w:tc>
+          <w:tcPr>
+            <w:tcW w:w="0" w:type="auto"/>
+            <w:tcBorders>
+              <w:top w:val="single" w:sz="4" w:space="0" w:color="auto"/>
+              <w:left w:val="single" w:sz="4" w:space="0" w:color="auto"/>
+              <w:bottom w:val="single" w:sz="4" w:space="0" w:color="auto"/>
+              <w:right w:val="single" w:sz="4" w:space="0" w:color="auto"/>
+            </w:tcBorders>
+            <w:shd w:val="clear" w:color="auto" w:fill="32374D"/>
+            <w:vAlign w:val="center"/>
+            <w:hideMark/>
+          </w:tcPr>
+          <w:p>
+            <w:pPr>
+              <w:spacing w:after="240"/>
+              <w:rPr>
+                <w:rFonts w:ascii="Segoe UI" w:eastAsia="Times New Roman" w:hAnsi="Segoe UI" w:cs="Segoe UI"/>
+                <w:color w:val="DEDEDE"/>
+                <w:sz w:val="20"/>
+                <w:szCs w:val="20"/>
+              </w:rPr>
+            </w:pPr>
+            <w:r>
+              <w:rPr>
+                <w:rFonts w:ascii="Segoe UI" w:eastAsia="Times New Roman" w:hAnsi="Segoe UI" w:cs="Segoe UI"/>
+                <w:color w:val="DEDEDE"/>
+                <w:sz w:val="20"/>
+                <w:szCs w:val="20"/>
+              </w:rPr>
+              <w:t>Windows</w:t>
+            </w:r>
+          </w:p>
+        </w:tc>
+        <w:tc>
+          <w:tcPr>
+            <w:tcW w:w="0" w:type="auto"/>
+            <w:tcBorders>
+              <w:top w:val="single" w:sz="4" w:space="0" w:color="auto"/>
+              <w:left w:val="single" w:sz="4" w:space="0" w:color="auto"/>
+              <w:bottom w:val="single" w:sz="4" w:space="0" w:color="auto"/>
+              <w:right w:val="single" w:sz="4" w:space="0" w:color="auto"/>
+            </w:tcBorders>
+            <w:shd w:val="clear" w:color="auto" w:fill="32374D"/>
+            <w:vAlign w:val="center"/>
+            <w:hideMark/>
+          </w:tcPr>
+          <w:p>
+            <w:pPr>
+              <w:spacing w:after="240"/>
+              <w:rPr>
+                <w:rFonts w:ascii="Segoe UI" w:eastAsia="Times New Roman" w:hAnsi="Segoe UI" w:cs="Segoe UI"/>
+                <w:color w:val="DEDEDE"/>
+                <w:sz w:val="20"/>
+                <w:szCs w:val="20"/>
+              </w:rPr>
+            </w:pPr>
+            <w:r>
+              <w:rPr>
+                <w:rFonts w:ascii="Consolas" w:eastAsia="Times New Roman" w:hAnsi="Consolas" w:cs="Courier New"/>
+                <w:color w:val="D7BA7D"/>
+                <w:sz w:val="18"/>
+                <w:szCs w:val="18"/>
+              </w:rPr>
+              <w:t>%AppData%\discord\IndexedDB\https_discord.com_0.indexeddb.leveldb\</w:t>
+            </w:r>
+          </w:p>
+        </w:tc>
+        <w:tc>
+          <w:tcPr>
+            <w:tcW w:w="0" w:type="auto"/>
+            <w:tcBorders>
+              <w:top w:val="single" w:sz="4" w:space="0" w:color="auto"/>
+              <w:left w:val="single" w:sz="4" w:space="0" w:color="auto"/>
+              <w:bottom w:val="single" w:sz="4" w:space="0" w:color="auto"/>
+              <w:right w:val="single" w:sz="4" w:space="0" w:color="auto"/>
+            </w:tcBorders>
+            <w:shd w:val="clear" w:color="auto" w:fill="32374D"/>
+            <w:vAlign w:val="center"/>
+            <w:hideMark/>
+          </w:tcPr>
+          <w:p>
+            <w:pPr>
+              <w:spacing w:after="240"/>
+              <w:rPr>
+                <w:rFonts w:ascii="Segoe UI" w:eastAsia="Times New Roman" w:hAnsi="Segoe UI" w:cs="Segoe UI"/>
+                <w:color w:val="DEDEDE"/>
+                <w:sz w:val="20"/>
+                <w:szCs w:val="20"/>
+              </w:rPr>
+            </w:pPr>
+            <w:r>
+              <w:rPr>
+                <w:rFonts w:ascii="Segoe UI" w:eastAsia="Times New Roman" w:hAnsi="Segoe UI" w:cs="Segoe UI"/>
+                <w:b/>
+                <w:bCs/>
+                <w:color w:val="DEDEDE"/>
+              </w:rPr>
+              <w:t>Y</w:t>
+            </w:r>
+          </w:p>
+        </w:tc>
+        <w:tc>
+          <w:tcPr>
+            <w:tcW w:w="0" w:type="auto"/>
+            <w:tcBorders>
+              <w:top w:val="single" w:sz="4" w:space="0" w:color="auto"/>
+              <w:left w:val="single" w:sz="4" w:space="0" w:color="auto"/>
+              <w:bottom w:val="single" w:sz="4" w:space="0" w:color="auto"/>
+              <w:right w:val="single" w:sz="4" w:space="0" w:color="auto"/>
+            </w:tcBorders>
+            <w:shd w:val="clear" w:color="auto" w:fill="32374D"/>
+            <w:vAlign w:val="center"/>
+            <w:hideMark/>
+          </w:tcPr>
+          <w:p>
+            <w:pPr>
+              <w:spacing w:after="240"/>
+              <w:rPr>
+                <w:rFonts w:ascii="Segoe UI" w:eastAsia="Times New Roman" w:hAnsi="Segoe UI" w:cs="Segoe UI"/>
+                <w:color w:val="DEDEDE"/>
+                <w:sz w:val="20"/>
+                <w:szCs w:val="20"/>
+              </w:rPr>
+            </w:pPr>
+            <w:proofErr w:type="spellStart"/>
+            <w:r>
+              <w:rPr>
+                <w:rFonts w:ascii="Segoe UI" w:eastAsia="Times New Roman" w:hAnsi="Segoe UI" w:cs="Segoe UI"/>
+                <w:color w:val="DEDEDE"/>
+                <w:sz w:val="20"/>
+                <w:szCs w:val="20"/>
+              </w:rPr>
+              <w:t>IndexedDB</w:t>
+            </w:r>
+            <w:proofErr w:type="spellEnd"/>
+            <w:r>
+              <w:rPr>
+                <w:rFonts w:ascii="Segoe UI" w:eastAsia="Times New Roman" w:hAnsi="Segoe UI" w:cs="Segoe UI"/>
+                <w:color w:val="DEDEDE"/>
+                <w:sz w:val="20"/>
+                <w:szCs w:val="20"/>
+              </w:rPr>
+              <w:t xml:space="preserve"> forensic tools, </w:t>
+            </w:r>
+            <w:proofErr w:type="spellStart"/>
+            <w:r>
+              <w:rPr>
+                <w:rFonts w:ascii="Segoe UI" w:eastAsia="Times New Roman" w:hAnsi="Segoe UI" w:cs="Segoe UI"/>
+                <w:color w:val="DEDEDE"/>
+                <w:sz w:val="20"/>
+                <w:szCs w:val="20"/>
+              </w:rPr>
+              <w:t>leveldb</w:t>
+            </w:r>
+            <w:proofErr w:type="spellEnd"/>
+            <w:r>
+              <w:rPr>
+                <w:rFonts w:ascii="Segoe UI" w:eastAsia="Times New Roman" w:hAnsi="Segoe UI" w:cs="Segoe UI"/>
+                <w:color w:val="DEDEDE"/>
+                <w:sz w:val="20"/>
+                <w:szCs w:val="20"/>
+              </w:rPr>
+              <w:t xml:space="preserve"> parsers</w:t>
+            </w:r>
+          </w:p>
+        </w:tc>
+        <w:tc>
+          <w:tcPr>
+            <w:tcW w:w="0" w:type="auto"/>
+            <w:tcBorders>
+              <w:top w:val="single" w:sz="4" w:space="0" w:color="auto"/>
+              <w:left w:val="single" w:sz="4" w:space="0" w:color="auto"/>
+              <w:bottom w:val="single" w:sz="4" w:space="0" w:color="auto"/>
+              <w:right w:val="single" w:sz="4" w:space="0" w:color="auto"/>
+            </w:tcBorders>
+            <w:shd w:val="clear" w:color="auto" w:fill="32374D"/>
+            <w:vAlign w:val="center"/>
+            <w:hideMark/>
+          </w:tcPr>
+          <w:p>
+            <w:pPr>
+              <w:spacing w:after="240"/>
+              <w:rPr>
+                <w:rFonts w:ascii="Segoe UI" w:eastAsia="Times New Roman" w:hAnsi="Segoe UI" w:cs="Segoe UI"/>
+                <w:color w:val="DEDEDE"/>
+                <w:sz w:val="20"/>
+                <w:szCs w:val="20"/>
+              </w:rPr>
+            </w:pPr>
+            <w:r>
+              <w:rPr>
+                <w:rFonts w:ascii="Segoe UI" w:eastAsia="Times New Roman" w:hAnsi="Segoe UI" w:cs="Segoe UI"/>
+                <w:color w:val="DEDEDE"/>
+                <w:sz w:val="20"/>
+                <w:szCs w:val="20"/>
+              </w:rPr>
+              <w:t xml:space="preserve">Stores </w:t>
+            </w:r>
+            <w:proofErr w:type="spellStart"/>
+            <w:r>
+              <w:rPr>
+                <w:rFonts w:ascii="Segoe UI" w:eastAsia="Times New Roman" w:hAnsi="Segoe UI" w:cs="Segoe UI"/>
+                <w:color w:val="DEDEDE"/>
+                <w:sz w:val="20"/>
+                <w:szCs w:val="20"/>
+              </w:rPr>
+              <w:t>Vencord</w:t>
+            </w:r>
+            <w:proofErr w:type="spellEnd"/>
+            <w:r>
+              <w:rPr>
+                <w:rFonts w:ascii="Segoe UI" w:eastAsia="Times New Roman" w:hAnsi="Segoe UI" w:cs="Segoe UI"/>
+                <w:color w:val="DEDEDE"/>
+                <w:sz w:val="20"/>
+                <w:szCs w:val="20"/>
+              </w:rPr>
+              <w:t xml:space="preserve"> plugin settings, notification logs, custom data. Survives app restart.</w:t>
+            </w:r>
+          </w:p>
+        </w:tc>
+      </w:tr>
+      <w:tr>
+        <w:trPr>
+          <w:trHeight w:val="1575"/>
+        </w:trPr>
+        <w:tc>
+          <w:tcPr>
+            <w:tcW w:w="0" w:type="auto"/>
+            <w:tcBorders>
+              <w:top w:val="single" w:sz="4" w:space="0" w:color="auto"/>
+              <w:left w:val="single" w:sz="4" w:space="0" w:color="auto"/>
+              <w:bottom w:val="single" w:sz="4" w:space="0" w:color="auto"/>
+              <w:right w:val="single" w:sz="4" w:space="0" w:color="auto"/>
+            </w:tcBorders>
+            <w:shd w:val="clear" w:color="auto" w:fill="32374D"/>
+            <w:vAlign w:val="center"/>
+            <w:hideMark/>
+          </w:tcPr>
+          <w:p>
+            <w:pPr>
+              <w:spacing w:after="240"/>
+              <w:rPr>
+                <w:rFonts w:ascii="Segoe UI" w:eastAsia="Times New Roman" w:hAnsi="Segoe UI" w:cs="Segoe UI"/>
+                <w:color w:val="DEDEDE"/>
+                <w:sz w:val="20"/>
+                <w:szCs w:val="20"/>
+              </w:rPr>
+            </w:pPr>
+            <w:proofErr w:type="spellStart"/>
+            <w:r>
+              <w:rPr>
+                <w:rFonts w:ascii="Segoe UI" w:eastAsia="Times New Roman" w:hAnsi="Segoe UI" w:cs="Segoe UI"/>
+                <w:b/>
+                <w:bCs/>
+                <w:color w:val="DEDEDE"/>
+              </w:rPr>
+              <w:t>IndexedDB</w:t>
+            </w:r>
+            <w:proofErr w:type="spellEnd"/>
+            <w:r>
+              <w:rPr>
+                <w:rFonts w:ascii="Segoe UI" w:eastAsia="Times New Roman" w:hAnsi="Segoe UI" w:cs="Segoe UI"/>
+                <w:b/>
+                <w:bCs/>
+                <w:color w:val="DEDEDE"/>
+              </w:rPr>
+              <w:t xml:space="preserve"> (</w:t>
+            </w:r>
+            <w:proofErr w:type="spellStart"/>
+            <w:r>
+              <w:rPr>
+                <w:rFonts w:ascii="Segoe UI" w:eastAsia="Times New Roman" w:hAnsi="Segoe UI" w:cs="Segoe UI"/>
+                <w:b/>
+                <w:bCs/>
+                <w:color w:val="DEDEDE"/>
+              </w:rPr>
+              <w:t>VencordData</w:t>
+            </w:r>
+            <w:proofErr w:type="spellEnd"/>
+            <w:r>
+              <w:rPr>
+                <w:rFonts w:ascii="Segoe UI" w:eastAsia="Times New Roman" w:hAnsi="Segoe UI" w:cs="Segoe UI"/>
+                <w:b/>
+                <w:bCs/>
+                <w:color w:val="DEDEDE"/>
+              </w:rPr>
+              <w:t>)</w:t>
+            </w:r>
+          </w:p>
+        </w:tc>
+        <w:tc>
+          <w:tcPr>
+            <w:tcW w:w="0" w:type="auto"/>
+            <w:tcBorders>
+              <w:top w:val="single" w:sz="4" w:space="0" w:color="auto"/>
+              <w:left w:val="single" w:sz="4" w:space="0" w:color="auto"/>
+              <w:bottom w:val="single" w:sz="4" w:space="0" w:color="auto"/>
+              <w:right w:val="single" w:sz="4" w:space="0" w:color="auto"/>
+            </w:tcBorders>
+            <w:shd w:val="clear" w:color="auto" w:fill="32374D"/>
+            <w:vAlign w:val="center"/>
+            <w:hideMark/>
+          </w:tcPr>
+          <w:p>
+            <w:pPr>
+              <w:spacing w:after="240"/>
+              <w:rPr>
+                <w:rFonts w:ascii="Segoe UI" w:eastAsia="Times New Roman" w:hAnsi="Segoe UI" w:cs="Segoe UI"/>
+                <w:color w:val="DEDEDE"/>
+                <w:sz w:val="20"/>
+                <w:szCs w:val="20"/>
+              </w:rPr>
+            </w:pPr>
+            <w:r>
+              <w:rPr>
+                <w:rFonts w:ascii="Segoe UI" w:eastAsia="Times New Roman" w:hAnsi="Segoe UI" w:cs="Segoe UI"/>
+                <w:color w:val="DEDEDE"/>
+                <w:sz w:val="20"/>
+                <w:szCs w:val="20"/>
+              </w:rPr>
+              <w:t>macOS</w:t>
+            </w:r>
+          </w:p>
+        </w:tc>
+        <w:tc>
+          <w:tcPr>
+            <w:tcW w:w="0" w:type="auto"/>
+            <w:tcBorders>
+              <w:top w:val="single" w:sz="4" w:space="0" w:color="auto"/>
+              <w:left w:val="single" w:sz="4" w:space="0" w:color="auto"/>
+              <w:bottom w:val="single" w:sz="4" w:space="0" w:color="auto"/>
+              <w:right w:val="single" w:sz="4" w:space="0" w:color="auto"/>
+            </w:tcBorders>
+            <w:shd w:val="clear" w:color="auto" w:fill="32374D"/>
+            <w:vAlign w:val="center"/>
+            <w:hideMark/>
+          </w:tcPr>
+          <w:p>
+            <w:pPr>
+              <w:spacing w:after="240"/>
+              <w:rPr>
+                <w:rFonts w:ascii="Segoe UI" w:eastAsia="Times New Roman" w:hAnsi="Segoe UI" w:cs="Segoe UI"/>
+                <w:color w:val="DEDEDE"/>
+                <w:sz w:val="20"/>
+                <w:szCs w:val="20"/>
+              </w:rPr>
+            </w:pPr>
+            <w:r>
+              <w:rPr>
+                <w:rFonts w:ascii="Consolas" w:eastAsia="Times New Roman" w:hAnsi="Consolas" w:cs="Courier New"/>
+                <w:color w:val="D7BA7D"/>
+                <w:sz w:val="18"/>
+                <w:szCs w:val="18"/>
+              </w:rPr>
+              <w:t>~/Library/Application Support/discord/</w:t>
+            </w:r>
+            <w:proofErr w:type="spellStart"/>
+            <w:r>
+              <w:rPr>
+                <w:rFonts w:ascii="Consolas" w:eastAsia="Times New Roman" w:hAnsi="Consolas" w:cs="Courier New"/>
+                <w:color w:val="D7BA7D"/>
+                <w:sz w:val="18"/>
+                <w:szCs w:val="18"/>
+              </w:rPr>
+              <w:t>IndexedDB</w:t>
+            </w:r>
+            <w:proofErr w:type="spellEnd"/>
+            <w:r>
+              <w:rPr>
+                <w:rFonts w:ascii="Consolas" w:eastAsia="Times New Roman" w:hAnsi="Consolas" w:cs="Courier New"/>
+                <w:color w:val="D7BA7D"/>
+                <w:sz w:val="18"/>
+                <w:szCs w:val="18"/>
+              </w:rPr>
+              <w:t>/https_discord.com_0.indexeddb.leveldb/</w:t>
+            </w:r>
+          </w:p>
+        </w:tc>
+        <w:tc>
+          <w:tcPr>
+            <w:tcW w:w="0" w:type="auto"/>
+            <w:tcBorders>
+              <w:top w:val="single" w:sz="4" w:space="0" w:color="auto"/>
+              <w:left w:val="single" w:sz="4" w:space="0" w:color="auto"/>
+              <w:bottom w:val="single" w:sz="4" w:space="0" w:color="auto"/>
+              <w:right w:val="single" w:sz="4" w:space="0" w:color="auto"/>
+            </w:tcBorders>
+            <w:shd w:val="clear" w:color="auto" w:fill="32374D"/>
+            <w:vAlign w:val="center"/>
+            <w:hideMark/>
+          </w:tcPr>
+          <w:p>
+            <w:pPr>
+              <w:spacing w:after="240"/>
+              <w:rPr>
+                <w:rFonts w:ascii="Segoe UI" w:eastAsia="Times New Roman" w:hAnsi="Segoe UI" w:cs="Segoe UI"/>
+                <w:color w:val="DEDEDE"/>
+                <w:sz w:val="20"/>
+                <w:szCs w:val="20"/>
+              </w:rPr>
+            </w:pPr>
+            <w:r>
+              <w:rPr>
+                <w:rFonts w:ascii="Segoe UI" w:eastAsia="Times New Roman" w:hAnsi="Segoe UI" w:cs="Segoe UI"/>
+                <w:b/>
+                <w:bCs/>
+                <w:color w:val="DEDEDE"/>
+              </w:rPr>
+              <w:t>Y</w:t>
+            </w:r>
+          </w:p>
+        </w:tc>
+        <w:tc>
+          <w:tcPr>
+            <w:tcW w:w="0" w:type="auto"/>
+            <w:tcBorders>
+              <w:top w:val="single" w:sz="4" w:space="0" w:color="auto"/>
+              <w:left w:val="single" w:sz="4" w:space="0" w:color="auto"/>
+              <w:bottom w:val="single" w:sz="4" w:space="0" w:color="auto"/>
+              <w:right w:val="single" w:sz="4" w:space="0" w:color="auto"/>
+            </w:tcBorders>
+            <w:shd w:val="clear" w:color="auto" w:fill="32374D"/>
+            <w:vAlign w:val="center"/>
+            <w:hideMark/>
+          </w:tcPr>
+          <w:p>
+            <w:pPr>
+              <w:spacing w:after="240"/>
+              <w:rPr>
+                <w:rFonts w:ascii="Segoe UI" w:eastAsia="Times New Roman" w:hAnsi="Segoe UI" w:cs="Segoe UI"/>
+                <w:color w:val="DEDEDE"/>
+                <w:sz w:val="20"/>
+                <w:szCs w:val="20"/>
+              </w:rPr>
+            </w:pPr>
+            <w:proofErr w:type="spellStart"/>
+            <w:r>
+              <w:rPr>
+                <w:rFonts w:ascii="Segoe UI" w:eastAsia="Times New Roman" w:hAnsi="Segoe UI" w:cs="Segoe UI"/>
+                <w:color w:val="DEDEDE"/>
+                <w:sz w:val="20"/>
+                <w:szCs w:val="20"/>
+              </w:rPr>
+              <w:t>IndexedDB</w:t>
+            </w:r>
+            <w:proofErr w:type="spellEnd"/>
+            <w:r>
+              <w:rPr>
+                <w:rFonts w:ascii="Segoe UI" w:eastAsia="Times New Roman" w:hAnsi="Segoe UI" w:cs="Segoe UI"/>
+                <w:color w:val="DEDEDE"/>
+                <w:sz w:val="20"/>
+                <w:szCs w:val="20"/>
+              </w:rPr>
+              <w:t xml:space="preserve"> forensic tools, </w:t>
+            </w:r>
+            <w:proofErr w:type="spellStart"/>
+            <w:r>
+              <w:rPr>
+                <w:rFonts w:ascii="Segoe UI" w:eastAsia="Times New Roman" w:hAnsi="Segoe UI" w:cs="Segoe UI"/>
+                <w:color w:val="DEDEDE"/>
+                <w:sz w:val="20"/>
+                <w:szCs w:val="20"/>
+              </w:rPr>
+              <w:t>leveldb</w:t>
+            </w:r>
+            <w:proofErr w:type="spellEnd"/>
+            <w:r>
+              <w:rPr>
+                <w:rFonts w:ascii="Segoe UI" w:eastAsia="Times New Roman" w:hAnsi="Segoe UI" w:cs="Segoe UI"/>
+                <w:color w:val="DEDEDE"/>
+                <w:sz w:val="20"/>
+                <w:szCs w:val="20"/>
+              </w:rPr>
+              <w:t xml:space="preserve"> parsers</w:t>
+            </w:r>
+          </w:p>
+        </w:tc>
+        <w:tc>
+          <w:tcPr>
+            <w:tcW w:w="0" w:type="auto"/>
+            <w:tcBorders>
+              <w:top w:val="single" w:sz="4" w:space="0" w:color="auto"/>
+              <w:left w:val="single" w:sz="4" w:space="0" w:color="auto"/>
+              <w:bottom w:val="single" w:sz="4" w:space="0" w:color="auto"/>
+              <w:right w:val="single" w:sz="4" w:space="0" w:color="auto"/>
+            </w:tcBorders>
+            <w:shd w:val="clear" w:color="auto" w:fill="32374D"/>
+            <w:vAlign w:val="center"/>
+            <w:hideMark/>
+          </w:tcPr>
+          <w:p>
+            <w:pPr>
+              <w:spacing w:after="240"/>
+              <w:rPr>
+                <w:rFonts w:ascii="Segoe UI" w:eastAsia="Times New Roman" w:hAnsi="Segoe UI" w:cs="Segoe UI"/>
+                <w:color w:val="DEDEDE"/>
+                <w:sz w:val="20"/>
+                <w:szCs w:val="20"/>
+              </w:rPr>
+            </w:pPr>
+            <w:r>
+              <w:rPr>
+                <w:rFonts w:ascii="Segoe UI" w:eastAsia="Times New Roman" w:hAnsi="Segoe UI" w:cs="Segoe UI"/>
+                <w:color w:val="DEDEDE"/>
+                <w:sz w:val="20"/>
+                <w:szCs w:val="20"/>
+              </w:rPr>
+              <w:t>Same as Windows</w:t>
+            </w:r>
+          </w:p>
+        </w:tc>
+      </w:tr>
+      <w:tr>
+        <w:trPr>
+          <w:trHeight w:val="1564"/>
+        </w:trPr>
+        <w:tc>
+          <w:tcPr>
+            <w:tcW w:w="0" w:type="auto"/>
+            <w:tcBorders>
+              <w:top w:val="single" w:sz="4" w:space="0" w:color="auto"/>
+              <w:left w:val="single" w:sz="4" w:space="0" w:color="auto"/>
+              <w:bottom w:val="single" w:sz="4" w:space="0" w:color="auto"/>
+              <w:right w:val="single" w:sz="4" w:space="0" w:color="auto"/>
+            </w:tcBorders>
+            <w:shd w:val="clear" w:color="auto" w:fill="32374D"/>
+            <w:vAlign w:val="center"/>
+            <w:hideMark/>
+          </w:tcPr>
+          <w:p>
+            <w:pPr>
+              <w:spacing w:after="240"/>
+              <w:rPr>
+                <w:rFonts w:ascii="Segoe UI" w:eastAsia="Times New Roman" w:hAnsi="Segoe UI" w:cs="Segoe UI"/>
+                <w:color w:val="DEDEDE"/>
+                <w:sz w:val="20"/>
+                <w:szCs w:val="20"/>
+              </w:rPr>
+            </w:pPr>
+            <w:proofErr w:type="spellStart"/>
+            <w:r>
+              <w:rPr>
+                <w:rFonts w:ascii="Segoe UI" w:eastAsia="Times New Roman" w:hAnsi="Segoe UI" w:cs="Segoe UI"/>
+                <w:b/>
+                <w:bCs/>
+                <w:color w:val="DEDEDE"/>
+              </w:rPr>
+              <w:t>IndexedDB</w:t>
+            </w:r>
+            <w:proofErr w:type="spellEnd"/>
+            <w:r>
+              <w:rPr>
+                <w:rFonts w:ascii="Segoe UI" w:eastAsia="Times New Roman" w:hAnsi="Segoe UI" w:cs="Segoe UI"/>
+                <w:b/>
+                <w:bCs/>
+                <w:color w:val="DEDEDE"/>
+              </w:rPr>
+              <w:t xml:space="preserve"> (</w:t>
+            </w:r>
+            <w:proofErr w:type="spellStart"/>
+            <w:r>
+              <w:rPr>
+                <w:rFonts w:ascii="Segoe UI" w:eastAsia="Times New Roman" w:hAnsi="Segoe UI" w:cs="Segoe UI"/>
+                <w:b/>
+                <w:bCs/>
+                <w:color w:val="DEDEDE"/>
+              </w:rPr>
+              <w:t>VencordData</w:t>
+            </w:r>
+            <w:proofErr w:type="spellEnd"/>
+            <w:r>
+              <w:rPr>
+                <w:rFonts w:ascii="Segoe UI" w:eastAsia="Times New Roman" w:hAnsi="Segoe UI" w:cs="Segoe UI"/>
+                <w:b/>
+                <w:bCs/>
+                <w:color w:val="DEDEDE"/>
+              </w:rPr>
+              <w:t>)</w:t>
+            </w:r>
+          </w:p>
+        </w:tc>
+        <w:tc>
+          <w:tcPr>
+            <w:tcW w:w="0" w:type="auto"/>
+            <w:tcBorders>
+              <w:top w:val="single" w:sz="4" w:space="0" w:color="auto"/>
+              <w:left w:val="single" w:sz="4" w:space="0" w:color="auto"/>
+              <w:bottom w:val="single" w:sz="4" w:space="0" w:color="auto"/>
+              <w:right w:val="single" w:sz="4" w:space="0" w:color="auto"/>
+            </w:tcBorders>
+            <w:shd w:val="clear" w:color="auto" w:fill="32374D"/>
+            <w:vAlign w:val="center"/>
+            <w:hideMark/>
+          </w:tcPr>
+          <w:p>
+            <w:pPr>
+              <w:spacing w:after="240"/>
+              <w:rPr>
+                <w:rFonts w:ascii="Segoe UI" w:eastAsia="Times New Roman" w:hAnsi="Segoe UI" w:cs="Segoe UI"/>
+                <w:color w:val="DEDEDE"/>
+                <w:sz w:val="20"/>
+                <w:szCs w:val="20"/>
+              </w:rPr>
+            </w:pPr>
+            <w:r>
+              <w:rPr>
+                <w:rFonts w:ascii="Segoe UI" w:eastAsia="Times New Roman" w:hAnsi="Segoe UI" w:cs="Segoe UI"/>
+                <w:color w:val="DEDEDE"/>
+                <w:sz w:val="20"/>
+                <w:szCs w:val="20"/>
+              </w:rPr>
+              <w:t>Linux</w:t>
+            </w:r>
+          </w:p>
+        </w:tc>
+        <w:tc>
+          <w:tcPr>
+            <w:tcW w:w="0" w:type="auto"/>
+            <w:tcBorders>
+              <w:top w:val="single" w:sz="4" w:space="0" w:color="auto"/>
+              <w:left w:val="single" w:sz="4" w:space="0" w:color="auto"/>
+              <w:bottom w:val="single" w:sz="4" w:space="0" w:color="auto"/>
+              <w:right w:val="single" w:sz="4" w:space="0" w:color="auto"/>
+            </w:tcBorders>
+            <w:shd w:val="clear" w:color="auto" w:fill="32374D"/>
+            <w:vAlign w:val="center"/>
+            <w:hideMark/>
+          </w:tcPr>
+          <w:p>
+            <w:pPr>
+              <w:spacing w:after="240"/>
+              <w:rPr>
+                <w:rFonts w:ascii="Segoe UI" w:eastAsia="Times New Roman" w:hAnsi="Segoe UI" w:cs="Segoe UI"/>
+                <w:color w:val="DEDEDE"/>
+                <w:sz w:val="20"/>
+                <w:szCs w:val="20"/>
+              </w:rPr>
+            </w:pPr>
+            <w:r>
+              <w:rPr>
+                <w:rFonts w:ascii="Consolas" w:eastAsia="Times New Roman" w:hAnsi="Consolas" w:cs="Courier New"/>
+                <w:color w:val="D7BA7D"/>
+                <w:sz w:val="18"/>
+                <w:szCs w:val="18"/>
+              </w:rPr>
+              <w:t>~/.config/discord/IndexedDB/https_discord.com_0.indexeddb.leveldb/</w:t>
+            </w:r>
+          </w:p>
+        </w:tc>
+        <w:tc>
+          <w:tcPr>
+            <w:tcW w:w="0" w:type="auto"/>
+            <w:tcBorders>
+              <w:top w:val="single" w:sz="4" w:space="0" w:color="auto"/>
+              <w:left w:val="single" w:sz="4" w:space="0" w:color="auto"/>
+              <w:bottom w:val="single" w:sz="4" w:space="0" w:color="auto"/>
+              <w:right w:val="single" w:sz="4" w:space="0" w:color="auto"/>
+            </w:tcBorders>
+            <w:shd w:val="clear" w:color="auto" w:fill="32374D"/>
+            <w:vAlign w:val="center"/>
+            <w:hideMark/>
+          </w:tcPr>
+          <w:p>
+            <w:pPr>
+              <w:spacing w:after="240"/>
+              <w:rPr>
+                <w:rFonts w:ascii="Segoe UI" w:eastAsia="Times New Roman" w:hAnsi="Segoe UI" w:cs="Segoe UI"/>
+                <w:color w:val="DEDEDE"/>
+                <w:sz w:val="20"/>
+                <w:szCs w:val="20"/>
+              </w:rPr>
+            </w:pPr>
+            <w:r>
+              <w:rPr>
+                <w:rFonts w:ascii="Segoe UI" w:eastAsia="Times New Roman" w:hAnsi="Segoe UI" w:cs="Segoe UI"/>
+                <w:b/>
+                <w:bCs/>
+                <w:color w:val="DEDEDE"/>
+              </w:rPr>
+              <w:t>Y</w:t>
+            </w:r>
+          </w:p>
+        </w:tc>
+        <w:tc>
+          <w:tcPr>
+            <w:tcW w:w="0" w:type="auto"/>
+            <w:tcBorders>
+              <w:top w:val="single" w:sz="4" w:space="0" w:color="auto"/>
+              <w:left w:val="single" w:sz="4" w:space="0" w:color="auto"/>
+              <w:bottom w:val="single" w:sz="4" w:space="0" w:color="auto"/>
+              <w:right w:val="single" w:sz="4" w:space="0" w:color="auto"/>
+            </w:tcBorders>
+            <w:shd w:val="clear" w:color="auto" w:fill="32374D"/>
+            <w:vAlign w:val="center"/>
+            <w:hideMark/>
+          </w:tcPr>
+          <w:p>
+            <w:pPr>
+              <w:spacing w:after="240"/>
+              <w:rPr>
+                <w:rFonts w:ascii="Segoe UI" w:eastAsia="Times New Roman" w:hAnsi="Segoe UI" w:cs="Segoe UI"/>
+                <w:color w:val="DEDEDE"/>
+                <w:sz w:val="20"/>
+                <w:szCs w:val="20"/>
+              </w:rPr>
+            </w:pPr>
+            <w:proofErr w:type="spellStart"/>
+            <w:r>
+              <w:rPr>
+                <w:rFonts w:ascii="Segoe UI" w:eastAsia="Times New Roman" w:hAnsi="Segoe UI" w:cs="Segoe UI"/>
+                <w:color w:val="DEDEDE"/>
+                <w:sz w:val="20"/>
+                <w:szCs w:val="20"/>
+              </w:rPr>
+              <w:t>IndexedDB</w:t>
+            </w:r>
+            <w:proofErr w:type="spellEnd"/>
+            <w:r>
+              <w:rPr>
+                <w:rFonts w:ascii="Segoe UI" w:eastAsia="Times New Roman" w:hAnsi="Segoe UI" w:cs="Segoe UI"/>
+                <w:color w:val="DEDEDE"/>
+                <w:sz w:val="20"/>
+                <w:szCs w:val="20"/>
+              </w:rPr>
+              <w:t xml:space="preserve"> forensic tools, </w:t>
+            </w:r>
+            <w:proofErr w:type="spellStart"/>
+            <w:r>
+              <w:rPr>
+                <w:rFonts w:ascii="Segoe UI" w:eastAsia="Times New Roman" w:hAnsi="Segoe UI" w:cs="Segoe UI"/>
+                <w:color w:val="DEDEDE"/>
+                <w:sz w:val="20"/>
+                <w:szCs w:val="20"/>
+              </w:rPr>
+              <w:t>leveldb</w:t>
+            </w:r>
+            <w:proofErr w:type="spellEnd"/>
+            <w:r>
+              <w:rPr>
+                <w:rFonts w:ascii="Segoe UI" w:eastAsia="Times New Roman" w:hAnsi="Segoe UI" w:cs="Segoe UI"/>
+                <w:color w:val="DEDEDE"/>
+                <w:sz w:val="20"/>
+                <w:szCs w:val="20"/>
+              </w:rPr>
+              <w:t xml:space="preserve"> parsers</w:t>
+            </w:r>
+          </w:p>
+        </w:tc>
+        <w:tc>
+          <w:tcPr>
+            <w:tcW w:w="0" w:type="auto"/>
+            <w:tcBorders>
+              <w:top w:val="single" w:sz="4" w:space="0" w:color="auto"/>
+              <w:left w:val="single" w:sz="4" w:space="0" w:color="auto"/>
+              <w:bottom w:val="single" w:sz="4" w:space="0" w:color="auto"/>
+              <w:right w:val="single" w:sz="4" w:space="0" w:color="auto"/>
+            </w:tcBorders>
+            <w:shd w:val="clear" w:color="auto" w:fill="32374D"/>
+            <w:vAlign w:val="center"/>
+            <w:hideMark/>
+          </w:tcPr>
+          <w:p>
+            <w:pPr>
+              <w:spacing w:after="240"/>
+              <w:rPr>
+                <w:rFonts w:ascii="Segoe UI" w:eastAsia="Times New Roman" w:hAnsi="Segoe UI" w:cs="Segoe UI"/>
+                <w:color w:val="DEDEDE"/>
+                <w:sz w:val="20"/>
+                <w:szCs w:val="20"/>
+              </w:rPr>
+            </w:pPr>
+            <w:r>
+              <w:rPr>
+                <w:rFonts w:ascii="Segoe UI" w:eastAsia="Times New Roman" w:hAnsi="Segoe UI" w:cs="Segoe UI"/>
+                <w:color w:val="DEDEDE"/>
+                <w:sz w:val="20"/>
+                <w:szCs w:val="20"/>
+              </w:rPr>
+              <w:t>Same as Windows</w:t>
+            </w:r>
+          </w:p>
+        </w:tc>
+      </w:tr>
+      <w:tr>
+        <w:trPr>
+          <w:trHeight w:val="1575"/>
+        </w:trPr>
+        <w:tc>
+          <w:tcPr>
+            <w:tcW w:w="0" w:type="auto"/>
+            <w:tcBorders>
+              <w:top w:val="single" w:sz="4" w:space="0" w:color="auto"/>
+              <w:left w:val="single" w:sz="4" w:space="0" w:color="auto"/>
+              <w:bottom w:val="single" w:sz="4" w:space="0" w:color="auto"/>
+              <w:right w:val="single" w:sz="4" w:space="0" w:color="auto"/>
+            </w:tcBorders>
+            <w:shd w:val="clear" w:color="auto" w:fill="32374D"/>
+            <w:vAlign w:val="center"/>
+            <w:hideMark/>
+          </w:tcPr>
+          <w:p>
+            <w:pPr>
+              <w:spacing w:after="240"/>
+              <w:rPr>
+                <w:rFonts w:ascii="Segoe UI" w:eastAsia="Times New Roman" w:hAnsi="Segoe UI" w:cs="Segoe UI"/>
+                <w:color w:val="DEDEDE"/>
+                <w:sz w:val="20"/>
+                <w:szCs w:val="20"/>
+              </w:rPr>
+            </w:pPr>
+            <w:proofErr w:type="spellStart"/>
+            <w:r>
+              <w:rPr>
+                <w:rFonts w:ascii="Segoe UI" w:eastAsia="Times New Roman" w:hAnsi="Segoe UI" w:cs="Segoe UI"/>
+                <w:b/>
+                <w:bCs/>
+                <w:color w:val="DEDEDE"/>
+              </w:rPr>
+              <w:t>localStorage</w:t>
+            </w:r>
+            <w:proofErr w:type="spellEnd"/>
+            <w:r>
+              <w:rPr>
+                <w:rFonts w:ascii="Segoe UI" w:eastAsia="Times New Roman" w:hAnsi="Segoe UI" w:cs="Segoe UI"/>
+                <w:b/>
+                <w:bCs/>
+                <w:color w:val="DEDEDE"/>
+              </w:rPr>
+              <w:t xml:space="preserve"> (</w:t>
+            </w:r>
+            <w:proofErr w:type="spellStart"/>
+            <w:r>
+              <w:rPr>
+                <w:rFonts w:ascii="Segoe UI" w:eastAsia="Times New Roman" w:hAnsi="Segoe UI" w:cs="Segoe UI"/>
+                <w:b/>
+                <w:bCs/>
+                <w:color w:val="DEDEDE"/>
+              </w:rPr>
+              <w:t>Vencord_settingsDirty</w:t>
+            </w:r>
+            <w:proofErr w:type="spellEnd"/>
+            <w:r>
+              <w:rPr>
+                <w:rFonts w:ascii="Segoe UI" w:eastAsia="Times New Roman" w:hAnsi="Segoe UI" w:cs="Segoe UI"/>
+                <w:b/>
+                <w:bCs/>
+                <w:color w:val="DEDEDE"/>
+              </w:rPr>
+              <w:t>)</w:t>
+            </w:r>
+          </w:p>
+        </w:tc>
+        <w:tc>
+          <w:tcPr>
+            <w:tcW w:w="0" w:type="auto"/>
+            <w:tcBorders>
+              <w:top w:val="single" w:sz="4" w:space="0" w:color="auto"/>
+              <w:left w:val="single" w:sz="4" w:space="0" w:color="auto"/>
+              <w:bottom w:val="single" w:sz="4" w:space="0" w:color="auto"/>
+              <w:right w:val="single" w:sz="4" w:space="0" w:color="auto"/>
+            </w:tcBorders>
+            <w:shd w:val="clear" w:color="auto" w:fill="32374D"/>
+            <w:vAlign w:val="center"/>
+            <w:hideMark/>
+          </w:tcPr>
+          <w:p>
+            <w:pPr>
+              <w:spacing w:after="240"/>
+              <w:rPr>
+                <w:rFonts w:ascii="Segoe UI" w:eastAsia="Times New Roman" w:hAnsi="Segoe UI" w:cs="Segoe UI"/>
+                <w:color w:val="DEDEDE"/>
+                <w:sz w:val="20"/>
+                <w:szCs w:val="20"/>
+              </w:rPr>
+            </w:pPr>
+            <w:r>
+              <w:rPr>
+                <w:rFonts w:ascii="Segoe UI" w:eastAsia="Times New Roman" w:hAnsi="Segoe UI" w:cs="Segoe UI"/>
+                <w:color w:val="DEDEDE"/>
+                <w:sz w:val="20"/>
+                <w:szCs w:val="20"/>
+              </w:rPr>
+              <w:t>Windows</w:t>
+            </w:r>
+          </w:p>
+        </w:tc>
+        <w:tc>
+          <w:tcPr>
+            <w:tcW w:w="0" w:type="auto"/>
+            <w:tcBorders>
+              <w:top w:val="single" w:sz="4" w:space="0" w:color="auto"/>
+              <w:left w:val="single" w:sz="4" w:space="0" w:color="auto"/>
+              <w:bottom w:val="single" w:sz="4" w:space="0" w:color="auto"/>
+              <w:right w:val="single" w:sz="4" w:space="0" w:color="auto"/>
+            </w:tcBorders>
+            <w:shd w:val="clear" w:color="auto" w:fill="32374D"/>
+            <w:vAlign w:val="center"/>
+            <w:hideMark/>
+          </w:tcPr>
+          <w:p>
+            <w:pPr>
+              <w:spacing w:after="240"/>
+              <w:rPr>
+                <w:rFonts w:ascii="Segoe UI" w:eastAsia="Times New Roman" w:hAnsi="Segoe UI" w:cs="Segoe UI"/>
+                <w:color w:val="DEDEDE"/>
+                <w:sz w:val="20"/>
+                <w:szCs w:val="20"/>
+              </w:rPr>
+            </w:pPr>
+            <w:r>
+              <w:rPr>
+                <w:rFonts w:ascii="Consolas" w:eastAsia="Times New Roman" w:hAnsi="Consolas" w:cs="Courier New"/>
+                <w:color w:val="D7BA7D"/>
+                <w:sz w:val="18"/>
+                <w:szCs w:val="18"/>
+              </w:rPr>
+              <w:t>%</w:t>
+            </w:r>
+            <w:proofErr w:type="spellStart"/>
+            <w:r>
+              <w:rPr>
+                <w:rFonts w:ascii="Consolas" w:eastAsia="Times New Roman" w:hAnsi="Consolas" w:cs="Courier New"/>
+                <w:color w:val="D7BA7D"/>
+                <w:sz w:val="18"/>
+                <w:szCs w:val="18"/>
+              </w:rPr>
+              <w:t>AppData</w:t>
+            </w:r>
+            <w:proofErr w:type="spellEnd"/>
+            <w:r>
+              <w:rPr>
+                <w:rFonts w:ascii="Consolas" w:eastAsia="Times New Roman" w:hAnsi="Consolas" w:cs="Courier New"/>
+                <w:color w:val="D7BA7D"/>
+                <w:sz w:val="18"/>
+                <w:szCs w:val="18"/>
+              </w:rPr>
+              <w:t>%\discord\Local Storage\</w:t>
+            </w:r>
+            <w:proofErr w:type="spellStart"/>
+            <w:r>
+              <w:rPr>
+                <w:rFonts w:ascii="Consolas" w:eastAsia="Times New Roman" w:hAnsi="Consolas" w:cs="Courier New"/>
+                <w:color w:val="D7BA7D"/>
+                <w:sz w:val="18"/>
+                <w:szCs w:val="18"/>
+              </w:rPr>
+              <w:t>leveldb</w:t>
+            </w:r>
+            <w:proofErr w:type="spellEnd"/>
+            <w:r>
+              <w:rPr>
+                <w:rFonts w:ascii="Consolas" w:eastAsia="Times New Roman" w:hAnsi="Consolas" w:cs="Courier New"/>
+                <w:color w:val="D7BA7D"/>
+                <w:sz w:val="18"/>
+                <w:szCs w:val="18"/>
+              </w:rPr>
+              <w:t>\</w:t>
+            </w:r>
+          </w:p>
+        </w:tc>
+        <w:tc>
+          <w:tcPr>
+            <w:tcW w:w="0" w:type="auto"/>
+            <w:tcBorders>
+              <w:top w:val="single" w:sz="4" w:space="0" w:color="auto"/>
+              <w:left w:val="single" w:sz="4" w:space="0" w:color="auto"/>
+              <w:bottom w:val="single" w:sz="4" w:space="0" w:color="auto"/>
+              <w:right w:val="single" w:sz="4" w:space="0" w:color="auto"/>
+            </w:tcBorders>
+            <w:shd w:val="clear" w:color="auto" w:fill="32374D"/>
+            <w:vAlign w:val="center"/>
+            <w:hideMark/>
+          </w:tcPr>
+          <w:p>
+            <w:pPr>
+              <w:spacing w:after="240"/>
+              <w:rPr>
+                <w:rFonts w:ascii="Segoe UI" w:eastAsia="Times New Roman" w:hAnsi="Segoe UI" w:cs="Segoe UI"/>
+                <w:color w:val="DEDEDE"/>
+                <w:sz w:val="20"/>
+                <w:szCs w:val="20"/>
+              </w:rPr>
+            </w:pPr>
+            <w:r>
+              <w:rPr>
+                <w:rFonts w:ascii="Segoe UI" w:eastAsia="Times New Roman" w:hAnsi="Segoe UI" w:cs="Segoe UI"/>
+                <w:b/>
+                <w:bCs/>
+                <w:color w:val="DEDEDE"/>
+              </w:rPr>
+              <w:t>Y</w:t>
+            </w:r>
+          </w:p>
+        </w:tc>
+        <w:tc>
+          <w:tcPr>
+            <w:tcW w:w="0" w:type="auto"/>
+            <w:tcBorders>
+              <w:top w:val="single" w:sz="4" w:space="0" w:color="auto"/>
+              <w:left w:val="single" w:sz="4" w:space="0" w:color="auto"/>
+              <w:bottom w:val="single" w:sz="4" w:space="0" w:color="auto"/>
+              <w:right w:val="single" w:sz="4" w:space="0" w:color="auto"/>
+            </w:tcBorders>
+            <w:shd w:val="clear" w:color="auto" w:fill="32374D"/>
+            <w:vAlign w:val="center"/>
+            <w:hideMark/>
+          </w:tcPr>
+          <w:p>
+            <w:pPr>
+              <w:spacing w:after="240"/>
+              <w:rPr>
+                <w:rFonts w:ascii="Segoe UI" w:eastAsia="Times New Roman" w:hAnsi="Segoe UI" w:cs="Segoe UI"/>
+                <w:color w:val="DEDEDE"/>
+                <w:sz w:val="20"/>
+                <w:szCs w:val="20"/>
+              </w:rPr>
+            </w:pPr>
+            <w:proofErr w:type="spellStart"/>
+            <w:r>
+              <w:rPr>
+                <w:rFonts w:ascii="Segoe UI" w:eastAsia="Times New Roman" w:hAnsi="Segoe UI" w:cs="Segoe UI"/>
+                <w:color w:val="DEDEDE"/>
+                <w:sz w:val="20"/>
+                <w:szCs w:val="20"/>
+              </w:rPr>
+              <w:t>LevelDB</w:t>
+            </w:r>
+            <w:proofErr w:type="spellEnd"/>
+            <w:r>
+              <w:rPr>
+                <w:rFonts w:ascii="Segoe UI" w:eastAsia="Times New Roman" w:hAnsi="Segoe UI" w:cs="Segoe UI"/>
+                <w:color w:val="DEDEDE"/>
+                <w:sz w:val="20"/>
+                <w:szCs w:val="20"/>
+              </w:rPr>
+              <w:t xml:space="preserve"> parsing tools</w:t>
+            </w:r>
+          </w:p>
+        </w:tc>
+        <w:tc>
+          <w:tcPr>
+            <w:tcW w:w="0" w:type="auto"/>
+            <w:tcBorders>
+              <w:top w:val="single" w:sz="4" w:space="0" w:color="auto"/>
+              <w:left w:val="single" w:sz="4" w:space="0" w:color="auto"/>
+              <w:bottom w:val="single" w:sz="4" w:space="0" w:color="auto"/>
+              <w:right w:val="single" w:sz="4" w:space="0" w:color="auto"/>
+            </w:tcBorders>
+            <w:shd w:val="clear" w:color="auto" w:fill="32374D"/>
+            <w:vAlign w:val="center"/>
+            <w:hideMark/>
+          </w:tcPr>
+          <w:p>
+            <w:pPr>
+              <w:spacing w:after="240"/>
+              <w:rPr>
+                <w:rFonts w:ascii="Segoe UI" w:eastAsia="Times New Roman" w:hAnsi="Segoe UI" w:cs="Segoe UI"/>
+                <w:color w:val="DEDEDE"/>
+                <w:sz w:val="20"/>
+                <w:szCs w:val="20"/>
+              </w:rPr>
+            </w:pPr>
+            <w:r>
+              <w:rPr>
+                <w:rFonts w:ascii="Segoe UI" w:eastAsia="Times New Roman" w:hAnsi="Segoe UI" w:cs="Segoe UI"/>
+                <w:color w:val="DEDEDE"/>
+                <w:sz w:val="20"/>
+                <w:szCs w:val="20"/>
+              </w:rPr>
+              <w:t xml:space="preserve">Contains </w:t>
+            </w:r>
+            <w:proofErr w:type="spellStart"/>
+            <w:r>
+              <w:rPr>
+                <w:rFonts w:ascii="Segoe UI" w:eastAsia="Times New Roman" w:hAnsi="Segoe UI" w:cs="Segoe UI"/>
+                <w:color w:val="DEDEDE"/>
+                <w:sz w:val="20"/>
+                <w:szCs w:val="20"/>
+              </w:rPr>
+              <w:t>Vencord</w:t>
+            </w:r>
+            <w:proofErr w:type="spellEnd"/>
+            <w:r>
+              <w:rPr>
+                <w:rFonts w:ascii="Segoe UI" w:eastAsia="Times New Roman" w:hAnsi="Segoe UI" w:cs="Segoe UI"/>
+                <w:color w:val="DEDEDE"/>
+                <w:sz w:val="20"/>
+                <w:szCs w:val="20"/>
+              </w:rPr>
+              <w:t xml:space="preserve"> settings and plugin configurations</w:t>
+            </w:r>
+          </w:p>
+        </w:tc>
+      </w:tr>
+      <w:tr>
+        <w:trPr>
+          <w:trHeight w:val="1035"/>
+        </w:trPr>
+        <w:tc>
+          <w:tcPr>
+            <w:tcW w:w="0" w:type="auto"/>
+            <w:tcBorders>
+              <w:top w:val="single" w:sz="4" w:space="0" w:color="auto"/>
+              <w:left w:val="single" w:sz="4" w:space="0" w:color="auto"/>
+              <w:bottom w:val="single" w:sz="4" w:space="0" w:color="auto"/>
+              <w:right w:val="single" w:sz="4" w:space="0" w:color="auto"/>
+            </w:tcBorders>
+            <w:shd w:val="clear" w:color="auto" w:fill="32374D"/>
+            <w:vAlign w:val="center"/>
+            <w:hideMark/>
+          </w:tcPr>
+          <w:p>
+            <w:pPr>
+              <w:spacing w:after="240"/>
+              <w:rPr>
+                <w:rFonts w:ascii="Segoe UI" w:eastAsia="Times New Roman" w:hAnsi="Segoe UI" w:cs="Segoe UI"/>
+                <w:color w:val="DEDEDE"/>
+                <w:sz w:val="20"/>
+                <w:szCs w:val="20"/>
+              </w:rPr>
+            </w:pPr>
+            <w:proofErr w:type="spellStart"/>
+            <w:r>
+              <w:rPr>
+                <w:rFonts w:ascii="Segoe UI" w:eastAsia="Times New Roman" w:hAnsi="Segoe UI" w:cs="Segoe UI"/>
+                <w:b/>
+                <w:bCs/>
+                <w:color w:val="DEDEDE"/>
+              </w:rPr>
+              <w:lastRenderedPageBreak/>
+              <w:t>localStorage</w:t>
+            </w:r>
+            <w:proofErr w:type="spellEnd"/>
+            <w:r>
+              <w:rPr>
+                <w:rFonts w:ascii="Segoe UI" w:eastAsia="Times New Roman" w:hAnsi="Segoe UI" w:cs="Segoe UI"/>
+                <w:b/>
+                <w:bCs/>
+                <w:color w:val="DEDEDE"/>
+              </w:rPr>
+              <w:t xml:space="preserve"> (</w:t>
+            </w:r>
+            <w:proofErr w:type="spellStart"/>
+            <w:r>
+              <w:rPr>
+                <w:rFonts w:ascii="Segoe UI" w:eastAsia="Times New Roman" w:hAnsi="Segoe UI" w:cs="Segoe UI"/>
+                <w:b/>
+                <w:bCs/>
+                <w:color w:val="DEDEDE"/>
+              </w:rPr>
+              <w:t>Vencord_settingsDirty</w:t>
+            </w:r>
+            <w:proofErr w:type="spellEnd"/>
+            <w:r>
+              <w:rPr>
+                <w:rFonts w:ascii="Segoe UI" w:eastAsia="Times New Roman" w:hAnsi="Segoe UI" w:cs="Segoe UI"/>
+                <w:b/>
+                <w:bCs/>
+                <w:color w:val="DEDEDE"/>
+              </w:rPr>
+              <w:t>)</w:t>
+            </w:r>
+          </w:p>
+        </w:tc>
+        <w:tc>
+          <w:tcPr>
+            <w:tcW w:w="0" w:type="auto"/>
+            <w:tcBorders>
+              <w:top w:val="single" w:sz="4" w:space="0" w:color="auto"/>
+              <w:left w:val="single" w:sz="4" w:space="0" w:color="auto"/>
+              <w:bottom w:val="single" w:sz="4" w:space="0" w:color="auto"/>
+              <w:right w:val="single" w:sz="4" w:space="0" w:color="auto"/>
+            </w:tcBorders>
+            <w:shd w:val="clear" w:color="auto" w:fill="32374D"/>
+            <w:vAlign w:val="center"/>
+            <w:hideMark/>
+          </w:tcPr>
+          <w:p>
+            <w:pPr>
+              <w:spacing w:after="240"/>
+              <w:rPr>
+                <w:rFonts w:ascii="Segoe UI" w:eastAsia="Times New Roman" w:hAnsi="Segoe UI" w:cs="Segoe UI"/>
+                <w:color w:val="DEDEDE"/>
+                <w:sz w:val="20"/>
+                <w:szCs w:val="20"/>
+              </w:rPr>
+            </w:pPr>
+            <w:r>
+              <w:rPr>
+                <w:rFonts w:ascii="Segoe UI" w:eastAsia="Times New Roman" w:hAnsi="Segoe UI" w:cs="Segoe UI"/>
+                <w:color w:val="DEDEDE"/>
+                <w:sz w:val="20"/>
+                <w:szCs w:val="20"/>
+              </w:rPr>
+              <w:t>macOS</w:t>
+            </w:r>
+          </w:p>
+        </w:tc>
+        <w:tc>
+          <w:tcPr>
+            <w:tcW w:w="0" w:type="auto"/>
+            <w:tcBorders>
+              <w:top w:val="single" w:sz="4" w:space="0" w:color="auto"/>
+              <w:left w:val="single" w:sz="4" w:space="0" w:color="auto"/>
+              <w:bottom w:val="single" w:sz="4" w:space="0" w:color="auto"/>
+              <w:right w:val="single" w:sz="4" w:space="0" w:color="auto"/>
+            </w:tcBorders>
+            <w:shd w:val="clear" w:color="auto" w:fill="32374D"/>
+            <w:vAlign w:val="center"/>
+            <w:hideMark/>
+          </w:tcPr>
+          <w:p>
+            <w:pPr>
+              <w:spacing w:after="240"/>
+              <w:rPr>
+                <w:rFonts w:ascii="Segoe UI" w:eastAsia="Times New Roman" w:hAnsi="Segoe UI" w:cs="Segoe UI"/>
+                <w:color w:val="DEDEDE"/>
+                <w:sz w:val="20"/>
+                <w:szCs w:val="20"/>
+              </w:rPr>
+            </w:pPr>
+            <w:r>
+              <w:rPr>
+                <w:rFonts w:ascii="Consolas" w:eastAsia="Times New Roman" w:hAnsi="Consolas" w:cs="Courier New"/>
+                <w:color w:val="D7BA7D"/>
+                <w:sz w:val="18"/>
+                <w:szCs w:val="18"/>
+              </w:rPr>
+              <w:t>~/Library/Application Support/discord/Local Storage/</w:t>
+            </w:r>
+            <w:proofErr w:type="spellStart"/>
+            <w:r>
+              <w:rPr>
+                <w:rFonts w:ascii="Consolas" w:eastAsia="Times New Roman" w:hAnsi="Consolas" w:cs="Courier New"/>
+                <w:color w:val="D7BA7D"/>
+                <w:sz w:val="18"/>
+                <w:szCs w:val="18"/>
+              </w:rPr>
+              <w:t>leveldb</w:t>
+            </w:r>
+            <w:proofErr w:type="spellEnd"/>
+            <w:r>
+              <w:rPr>
+                <w:rFonts w:ascii="Consolas" w:eastAsia="Times New Roman" w:hAnsi="Consolas" w:cs="Courier New"/>
+                <w:color w:val="D7BA7D"/>
+                <w:sz w:val="18"/>
+                <w:szCs w:val="18"/>
+              </w:rPr>
+              <w:t>/</w:t>
+            </w:r>
+          </w:p>
+        </w:tc>
+        <w:tc>
+          <w:tcPr>
+            <w:tcW w:w="0" w:type="auto"/>
+            <w:tcBorders>
+              <w:top w:val="single" w:sz="4" w:space="0" w:color="auto"/>
+              <w:left w:val="single" w:sz="4" w:space="0" w:color="auto"/>
+              <w:bottom w:val="single" w:sz="4" w:space="0" w:color="auto"/>
+              <w:right w:val="single" w:sz="4" w:space="0" w:color="auto"/>
+            </w:tcBorders>
+            <w:shd w:val="clear" w:color="auto" w:fill="32374D"/>
+            <w:vAlign w:val="center"/>
+            <w:hideMark/>
+          </w:tcPr>
+          <w:p>
+            <w:pPr>
+              <w:spacing w:after="240"/>
+              <w:rPr>
+                <w:rFonts w:ascii="Segoe UI" w:eastAsia="Times New Roman" w:hAnsi="Segoe UI" w:cs="Segoe UI"/>
+                <w:color w:val="DEDEDE"/>
+                <w:sz w:val="20"/>
+                <w:szCs w:val="20"/>
+              </w:rPr>
+            </w:pPr>
+            <w:r>
+              <w:rPr>
+                <w:rFonts w:ascii="Segoe UI" w:eastAsia="Times New Roman" w:hAnsi="Segoe UI" w:cs="Segoe UI"/>
+                <w:b/>
+                <w:bCs/>
+                <w:color w:val="DEDEDE"/>
+              </w:rPr>
+              <w:t>Y</w:t>
+            </w:r>
+          </w:p>
+        </w:tc>
+        <w:tc>
+          <w:tcPr>
+            <w:tcW w:w="0" w:type="auto"/>
+            <w:tcBorders>
+              <w:top w:val="single" w:sz="4" w:space="0" w:color="auto"/>
+              <w:left w:val="single" w:sz="4" w:space="0" w:color="auto"/>
+              <w:bottom w:val="single" w:sz="4" w:space="0" w:color="auto"/>
+              <w:right w:val="single" w:sz="4" w:space="0" w:color="auto"/>
+            </w:tcBorders>
+            <w:shd w:val="clear" w:color="auto" w:fill="32374D"/>
+            <w:vAlign w:val="center"/>
+            <w:hideMark/>
+          </w:tcPr>
+          <w:p>
+            <w:pPr>
+              <w:spacing w:after="240"/>
+              <w:rPr>
+                <w:rFonts w:ascii="Segoe UI" w:eastAsia="Times New Roman" w:hAnsi="Segoe UI" w:cs="Segoe UI"/>
+                <w:color w:val="DEDEDE"/>
+                <w:sz w:val="20"/>
+                <w:szCs w:val="20"/>
+              </w:rPr>
+            </w:pPr>
+            <w:proofErr w:type="spellStart"/>
+            <w:r>
+              <w:rPr>
+                <w:rFonts w:ascii="Segoe UI" w:eastAsia="Times New Roman" w:hAnsi="Segoe UI" w:cs="Segoe UI"/>
+                <w:color w:val="DEDEDE"/>
+                <w:sz w:val="20"/>
+                <w:szCs w:val="20"/>
+              </w:rPr>
+              <w:t>LevelDB</w:t>
+            </w:r>
+            <w:proofErr w:type="spellEnd"/>
+            <w:r>
+              <w:rPr>
+                <w:rFonts w:ascii="Segoe UI" w:eastAsia="Times New Roman" w:hAnsi="Segoe UI" w:cs="Segoe UI"/>
+                <w:color w:val="DEDEDE"/>
+                <w:sz w:val="20"/>
+                <w:szCs w:val="20"/>
+              </w:rPr>
+              <w:t xml:space="preserve"> parsing tools</w:t>
+            </w:r>
+          </w:p>
+        </w:tc>
+        <w:tc>
+          <w:tcPr>
+            <w:tcW w:w="0" w:type="auto"/>
+            <w:tcBorders>
+              <w:top w:val="single" w:sz="4" w:space="0" w:color="auto"/>
+              <w:left w:val="single" w:sz="4" w:space="0" w:color="auto"/>
+              <w:bottom w:val="single" w:sz="4" w:space="0" w:color="auto"/>
+              <w:right w:val="single" w:sz="4" w:space="0" w:color="auto"/>
+            </w:tcBorders>
+            <w:shd w:val="clear" w:color="auto" w:fill="32374D"/>
+            <w:vAlign w:val="center"/>
+            <w:hideMark/>
+          </w:tcPr>
+          <w:p>
+            <w:pPr>
+              <w:spacing w:after="240"/>
+              <w:rPr>
+                <w:rFonts w:ascii="Segoe UI" w:eastAsia="Times New Roman" w:hAnsi="Segoe UI" w:cs="Segoe UI"/>
+                <w:color w:val="DEDEDE"/>
+                <w:sz w:val="20"/>
+                <w:szCs w:val="20"/>
+              </w:rPr>
+            </w:pPr>
+            <w:r>
+              <w:rPr>
+                <w:rFonts w:ascii="Segoe UI" w:eastAsia="Times New Roman" w:hAnsi="Segoe UI" w:cs="Segoe UI"/>
+                <w:color w:val="DEDEDE"/>
+                <w:sz w:val="20"/>
+                <w:szCs w:val="20"/>
+              </w:rPr>
+              <w:t>Same as Windows</w:t>
+            </w:r>
+          </w:p>
+        </w:tc>
+      </w:tr>
+      <w:tr>
+        <w:trPr>
+          <w:trHeight w:val="563"/>
+        </w:trPr>
+        <w:tc>
+          <w:tcPr>
+            <w:tcW w:w="0" w:type="auto"/>
+            <w:tcBorders>
+              <w:top w:val="single" w:sz="4" w:space="0" w:color="auto"/>
+              <w:left w:val="single" w:sz="4" w:space="0" w:color="auto"/>
+              <w:bottom w:val="single" w:sz="4" w:space="0" w:color="auto"/>
+              <w:right w:val="single" w:sz="4" w:space="0" w:color="auto"/>
+            </w:tcBorders>
+            <w:shd w:val="clear" w:color="auto" w:fill="32374D"/>
+            <w:vAlign w:val="center"/>
+            <w:hideMark/>
+          </w:tcPr>
+          <w:p>
+            <w:pPr>
+              <w:spacing w:after="240"/>
+              <w:rPr>
+                <w:rFonts w:ascii="Segoe UI" w:eastAsia="Times New Roman" w:hAnsi="Segoe UI" w:cs="Segoe UI"/>
+                <w:color w:val="DEDEDE"/>
+                <w:sz w:val="20"/>
+                <w:szCs w:val="20"/>
+              </w:rPr>
+            </w:pPr>
+            <w:proofErr w:type="spellStart"/>
+            <w:r>
+              <w:rPr>
+                <w:rFonts w:ascii="Segoe UI" w:eastAsia="Times New Roman" w:hAnsi="Segoe UI" w:cs="Segoe UI"/>
+                <w:b/>
+                <w:bCs/>
+                <w:color w:val="DEDEDE"/>
+              </w:rPr>
+              <w:t>localStorage</w:t>
+            </w:r>
+            <w:proofErr w:type="spellEnd"/>
+            <w:r>
+              <w:rPr>
+                <w:rFonts w:ascii="Segoe UI" w:eastAsia="Times New Roman" w:hAnsi="Segoe UI" w:cs="Segoe UI"/>
+                <w:b/>
+                <w:bCs/>
+                <w:color w:val="DEDEDE"/>
+              </w:rPr>
+              <w:t xml:space="preserve"> (</w:t>
+            </w:r>
+            <w:proofErr w:type="spellStart"/>
+            <w:r>
+              <w:rPr>
+                <w:rFonts w:ascii="Segoe UI" w:eastAsia="Times New Roman" w:hAnsi="Segoe UI" w:cs="Segoe UI"/>
+                <w:b/>
+                <w:bCs/>
+                <w:color w:val="DEDEDE"/>
+              </w:rPr>
+              <w:t>Vencord_settingsDirty</w:t>
+            </w:r>
+            <w:proofErr w:type="spellEnd"/>
+            <w:r>
+              <w:rPr>
+                <w:rFonts w:ascii="Segoe UI" w:eastAsia="Times New Roman" w:hAnsi="Segoe UI" w:cs="Segoe UI"/>
+                <w:b/>
+                <w:bCs/>
+                <w:color w:val="DEDEDE"/>
+              </w:rPr>
+              <w:t>)</w:t>
+            </w:r>
+          </w:p>
+        </w:tc>
+        <w:tc>
+          <w:tcPr>
+            <w:tcW w:w="0" w:type="auto"/>
+            <w:tcBorders>
+              <w:top w:val="single" w:sz="4" w:space="0" w:color="auto"/>
+              <w:left w:val="single" w:sz="4" w:space="0" w:color="auto"/>
+              <w:bottom w:val="single" w:sz="4" w:space="0" w:color="auto"/>
+              <w:right w:val="single" w:sz="4" w:space="0" w:color="auto"/>
+            </w:tcBorders>
+            <w:shd w:val="clear" w:color="auto" w:fill="32374D"/>
+            <w:vAlign w:val="center"/>
+            <w:hideMark/>
+          </w:tcPr>
+          <w:p>
+            <w:pPr>
+              <w:spacing w:after="240"/>
+              <w:rPr>
+                <w:rFonts w:ascii="Segoe UI" w:eastAsia="Times New Roman" w:hAnsi="Segoe UI" w:cs="Segoe UI"/>
+                <w:color w:val="DEDEDE"/>
+                <w:sz w:val="20"/>
+                <w:szCs w:val="20"/>
+              </w:rPr>
+            </w:pPr>
+            <w:r>
+              <w:rPr>
+                <w:rFonts w:ascii="Segoe UI" w:eastAsia="Times New Roman" w:hAnsi="Segoe UI" w:cs="Segoe UI"/>
+                <w:color w:val="DEDEDE"/>
+                <w:sz w:val="20"/>
+                <w:szCs w:val="20"/>
+              </w:rPr>
+              <w:t>Linux</w:t>
+            </w:r>
+          </w:p>
+        </w:tc>
+        <w:tc>
+          <w:tcPr>
+            <w:tcW w:w="0" w:type="auto"/>
+            <w:tcBorders>
+              <w:top w:val="single" w:sz="4" w:space="0" w:color="auto"/>
+              <w:left w:val="single" w:sz="4" w:space="0" w:color="auto"/>
+              <w:bottom w:val="single" w:sz="4" w:space="0" w:color="auto"/>
+              <w:right w:val="single" w:sz="4" w:space="0" w:color="auto"/>
+            </w:tcBorders>
+            <w:shd w:val="clear" w:color="auto" w:fill="32374D"/>
+            <w:vAlign w:val="center"/>
+            <w:hideMark/>
+          </w:tcPr>
+          <w:p>
+            <w:pPr>
+              <w:spacing w:after="240"/>
+              <w:rPr>
+                <w:rFonts w:ascii="Segoe UI" w:eastAsia="Times New Roman" w:hAnsi="Segoe UI" w:cs="Segoe UI"/>
+                <w:color w:val="DEDEDE"/>
+                <w:sz w:val="20"/>
+                <w:szCs w:val="20"/>
+              </w:rPr>
+            </w:pPr>
+            <w:r>
+              <w:rPr>
+                <w:rFonts w:ascii="Consolas" w:eastAsia="Times New Roman" w:hAnsi="Consolas" w:cs="Courier New"/>
+                <w:color w:val="D7BA7D"/>
+                <w:sz w:val="18"/>
+                <w:szCs w:val="18"/>
+              </w:rPr>
+              <w:t>~/.config/discord/Local Storage/</w:t>
+            </w:r>
+            <w:proofErr w:type="spellStart"/>
+            <w:r>
+              <w:rPr>
+                <w:rFonts w:ascii="Consolas" w:eastAsia="Times New Roman" w:hAnsi="Consolas" w:cs="Courier New"/>
+                <w:color w:val="D7BA7D"/>
+                <w:sz w:val="18"/>
+                <w:szCs w:val="18"/>
+              </w:rPr>
+              <w:t>leveldb</w:t>
+            </w:r>
+            <w:proofErr w:type="spellEnd"/>
+            <w:r>
+              <w:rPr>
+                <w:rFonts w:ascii="Consolas" w:eastAsia="Times New Roman" w:hAnsi="Consolas" w:cs="Courier New"/>
+                <w:color w:val="D7BA7D"/>
+                <w:sz w:val="18"/>
+                <w:szCs w:val="18"/>
+              </w:rPr>
+              <w:t>/</w:t>
+            </w:r>
+          </w:p>
+        </w:tc>
+        <w:tc>
+          <w:tcPr>
+            <w:tcW w:w="0" w:type="auto"/>
+            <w:tcBorders>
+              <w:top w:val="single" w:sz="4" w:space="0" w:color="auto"/>
+              <w:left w:val="single" w:sz="4" w:space="0" w:color="auto"/>
+              <w:bottom w:val="single" w:sz="4" w:space="0" w:color="auto"/>
+              <w:right w:val="single" w:sz="4" w:space="0" w:color="auto"/>
+            </w:tcBorders>
+            <w:shd w:val="clear" w:color="auto" w:fill="32374D"/>
+            <w:vAlign w:val="center"/>
+            <w:hideMark/>
+          </w:tcPr>
+          <w:p>
+            <w:pPr>
+              <w:spacing w:after="240"/>
+              <w:rPr>
+                <w:rFonts w:ascii="Segoe UI" w:eastAsia="Times New Roman" w:hAnsi="Segoe UI" w:cs="Segoe UI"/>
+                <w:color w:val="DEDEDE"/>
+                <w:sz w:val="20"/>
+                <w:szCs w:val="20"/>
+              </w:rPr>
+            </w:pPr>
+            <w:r>
+              <w:rPr>
+                <w:rFonts w:ascii="Segoe UI" w:eastAsia="Times New Roman" w:hAnsi="Segoe UI" w:cs="Segoe UI"/>
+                <w:b/>
+                <w:bCs/>
+                <w:color w:val="DEDEDE"/>
+              </w:rPr>
+              <w:t>Y</w:t>
+            </w:r>
+          </w:p>
+        </w:tc>
+        <w:tc>
+          <w:tcPr>
+            <w:tcW w:w="0" w:type="auto"/>
+            <w:tcBorders>
+              <w:top w:val="single" w:sz="4" w:space="0" w:color="auto"/>
+              <w:left w:val="single" w:sz="4" w:space="0" w:color="auto"/>
+              <w:bottom w:val="single" w:sz="4" w:space="0" w:color="auto"/>
+              <w:right w:val="single" w:sz="4" w:space="0" w:color="auto"/>
+            </w:tcBorders>
+            <w:shd w:val="clear" w:color="auto" w:fill="32374D"/>
+            <w:vAlign w:val="center"/>
+            <w:hideMark/>
+          </w:tcPr>
+          <w:p>
+            <w:pPr>
+              <w:spacing w:after="240"/>
+              <w:rPr>
+                <w:rFonts w:ascii="Segoe UI" w:eastAsia="Times New Roman" w:hAnsi="Segoe UI" w:cs="Segoe UI"/>
+                <w:color w:val="DEDEDE"/>
+                <w:sz w:val="20"/>
+                <w:szCs w:val="20"/>
+              </w:rPr>
+            </w:pPr>
+            <w:proofErr w:type="spellStart"/>
+            <w:r>
+              <w:rPr>
+                <w:rFonts w:ascii="Segoe UI" w:eastAsia="Times New Roman" w:hAnsi="Segoe UI" w:cs="Segoe UI"/>
+                <w:color w:val="DEDEDE"/>
+                <w:sz w:val="20"/>
+                <w:szCs w:val="20"/>
+              </w:rPr>
+              <w:t>LevelDB</w:t>
+            </w:r>
+            <w:proofErr w:type="spellEnd"/>
+            <w:r>
+              <w:rPr>
+                <w:rFonts w:ascii="Segoe UI" w:eastAsia="Times New Roman" w:hAnsi="Segoe UI" w:cs="Segoe UI"/>
+                <w:color w:val="DEDEDE"/>
+                <w:sz w:val="20"/>
+                <w:szCs w:val="20"/>
+              </w:rPr>
+              <w:t xml:space="preserve"> parsing tools</w:t>
+            </w:r>
+          </w:p>
+        </w:tc>
+        <w:tc>
+          <w:tcPr>
+            <w:tcW w:w="0" w:type="auto"/>
+            <w:tcBorders>
+              <w:top w:val="single" w:sz="4" w:space="0" w:color="auto"/>
+              <w:left w:val="single" w:sz="4" w:space="0" w:color="auto"/>
+              <w:bottom w:val="single" w:sz="4" w:space="0" w:color="auto"/>
+              <w:right w:val="single" w:sz="4" w:space="0" w:color="auto"/>
+            </w:tcBorders>
+            <w:shd w:val="clear" w:color="auto" w:fill="32374D"/>
+            <w:vAlign w:val="center"/>
+            <w:hideMark/>
+          </w:tcPr>
+          <w:p>
+            <w:pPr>
+              <w:spacing w:after="240"/>
+              <w:rPr>
+                <w:rFonts w:ascii="Segoe UI" w:eastAsia="Times New Roman" w:hAnsi="Segoe UI" w:cs="Segoe UI"/>
+                <w:color w:val="DEDEDE"/>
+                <w:sz w:val="20"/>
+                <w:szCs w:val="20"/>
+              </w:rPr>
+            </w:pPr>
+            <w:r>
+              <w:rPr>
+                <w:rFonts w:ascii="Segoe UI" w:eastAsia="Times New Roman" w:hAnsi="Segoe UI" w:cs="Segoe UI"/>
+                <w:color w:val="DEDEDE"/>
+                <w:sz w:val="20"/>
+                <w:szCs w:val="20"/>
+              </w:rPr>
+              <w:t>Same as Windows</w:t>
+            </w:r>
+          </w:p>
+        </w:tc>
+      </w:tr>
+      <w:tr>
+        <w:trPr>
+          <w:trHeight w:val="1829"/>
+        </w:trPr>
+        <w:tc>
+          <w:tcPr>
+            <w:tcW w:w="0" w:type="auto"/>
+            <w:tcBorders>
+              <w:top w:val="single" w:sz="4" w:space="0" w:color="auto"/>
+              <w:left w:val="single" w:sz="4" w:space="0" w:color="auto"/>
+              <w:bottom w:val="single" w:sz="4" w:space="0" w:color="auto"/>
+              <w:right w:val="single" w:sz="4" w:space="0" w:color="auto"/>
+            </w:tcBorders>
+            <w:shd w:val="clear" w:color="auto" w:fill="32374D"/>
+            <w:vAlign w:val="center"/>
+            <w:hideMark/>
+          </w:tcPr>
+          <w:p>
+            <w:pPr>
+              <w:spacing w:after="240"/>
+              <w:rPr>
+                <w:rFonts w:ascii="Segoe UI" w:eastAsia="Times New Roman" w:hAnsi="Segoe UI" w:cs="Segoe UI"/>
+                <w:color w:val="DEDEDE"/>
+                <w:sz w:val="20"/>
+                <w:szCs w:val="20"/>
+              </w:rPr>
+            </w:pPr>
+            <w:r>
+              <w:rPr>
+                <w:rFonts w:ascii="Segoe UI" w:eastAsia="Times New Roman" w:hAnsi="Segoe UI" w:cs="Segoe UI"/>
+                <w:b/>
+                <w:bCs/>
+                <w:color w:val="DEDEDE"/>
+              </w:rPr>
+              <w:t>Discord Message Cache</w:t>
+            </w:r>
+          </w:p>
+        </w:tc>
+        <w:tc>
+          <w:tcPr>
+            <w:tcW w:w="0" w:type="auto"/>
+            <w:tcBorders>
+              <w:top w:val="single" w:sz="4" w:space="0" w:color="auto"/>
+              <w:left w:val="single" w:sz="4" w:space="0" w:color="auto"/>
+              <w:bottom w:val="single" w:sz="4" w:space="0" w:color="auto"/>
+              <w:right w:val="single" w:sz="4" w:space="0" w:color="auto"/>
+            </w:tcBorders>
+            <w:shd w:val="clear" w:color="auto" w:fill="32374D"/>
+            <w:vAlign w:val="center"/>
+            <w:hideMark/>
+          </w:tcPr>
+          <w:p>
+            <w:pPr>
+              <w:spacing w:after="240"/>
+              <w:rPr>
+                <w:rFonts w:ascii="Segoe UI" w:eastAsia="Times New Roman" w:hAnsi="Segoe UI" w:cs="Segoe UI"/>
+                <w:color w:val="DEDEDE"/>
+                <w:sz w:val="20"/>
+                <w:szCs w:val="20"/>
+              </w:rPr>
+            </w:pPr>
+            <w:r>
+              <w:rPr>
+                <w:rFonts w:ascii="Segoe UI" w:eastAsia="Times New Roman" w:hAnsi="Segoe UI" w:cs="Segoe UI"/>
+                <w:color w:val="DEDEDE"/>
+                <w:sz w:val="20"/>
+                <w:szCs w:val="20"/>
+              </w:rPr>
+              <w:t>All</w:t>
+            </w:r>
+          </w:p>
+        </w:tc>
+        <w:tc>
+          <w:tcPr>
+            <w:tcW w:w="0" w:type="auto"/>
+            <w:tcBorders>
+              <w:top w:val="single" w:sz="4" w:space="0" w:color="auto"/>
+              <w:left w:val="single" w:sz="4" w:space="0" w:color="auto"/>
+              <w:bottom w:val="single" w:sz="4" w:space="0" w:color="auto"/>
+              <w:right w:val="single" w:sz="4" w:space="0" w:color="auto"/>
+            </w:tcBorders>
+            <w:shd w:val="clear" w:color="auto" w:fill="32374D"/>
+            <w:vAlign w:val="center"/>
+            <w:hideMark/>
+          </w:tcPr>
+          <w:p>
+            <w:pPr>
+              <w:spacing w:after="240"/>
+              <w:rPr>
+                <w:rFonts w:ascii="Segoe UI" w:eastAsia="Times New Roman" w:hAnsi="Segoe UI" w:cs="Segoe UI"/>
+                <w:color w:val="DEDEDE"/>
+                <w:sz w:val="20"/>
+                <w:szCs w:val="20"/>
+              </w:rPr>
+            </w:pPr>
+            <w:r>
+              <w:rPr>
+                <w:rFonts w:ascii="Segoe UI" w:eastAsia="Times New Roman" w:hAnsi="Segoe UI" w:cs="Segoe UI"/>
+                <w:color w:val="DEDEDE"/>
+                <w:sz w:val="20"/>
+                <w:szCs w:val="20"/>
+              </w:rPr>
+              <w:t>In-memory only (Electron process RAM)</w:t>
+            </w:r>
+          </w:p>
+        </w:tc>
+        <w:tc>
+          <w:tcPr>
+            <w:tcW w:w="0" w:type="auto"/>
+            <w:tcBorders>
+              <w:top w:val="single" w:sz="4" w:space="0" w:color="auto"/>
+              <w:left w:val="single" w:sz="4" w:space="0" w:color="auto"/>
+              <w:bottom w:val="single" w:sz="4" w:space="0" w:color="auto"/>
+              <w:right w:val="single" w:sz="4" w:space="0" w:color="auto"/>
+            </w:tcBorders>
+            <w:shd w:val="clear" w:color="auto" w:fill="32374D"/>
+            <w:vAlign w:val="center"/>
+            <w:hideMark/>
+          </w:tcPr>
+          <w:p>
+            <w:pPr>
+              <w:spacing w:after="240"/>
+              <w:rPr>
+                <w:rFonts w:ascii="Segoe UI" w:eastAsia="Times New Roman" w:hAnsi="Segoe UI" w:cs="Segoe UI"/>
+                <w:color w:val="DEDEDE"/>
+                <w:sz w:val="20"/>
+                <w:szCs w:val="20"/>
+              </w:rPr>
+            </w:pPr>
+            <w:r>
+              <w:rPr>
+                <w:rFonts w:ascii="Segoe UI" w:eastAsia="Times New Roman" w:hAnsi="Segoe UI" w:cs="Segoe UI"/>
+                <w:b/>
+                <w:bCs/>
+                <w:color w:val="DEDEDE"/>
+              </w:rPr>
+              <w:t>N</w:t>
+            </w:r>
+          </w:p>
+        </w:tc>
+        <w:tc>
+          <w:tcPr>
+            <w:tcW w:w="0" w:type="auto"/>
+            <w:tcBorders>
+              <w:top w:val="single" w:sz="4" w:space="0" w:color="auto"/>
+              <w:left w:val="single" w:sz="4" w:space="0" w:color="auto"/>
+              <w:bottom w:val="single" w:sz="4" w:space="0" w:color="auto"/>
+              <w:right w:val="single" w:sz="4" w:space="0" w:color="auto"/>
+            </w:tcBorders>
+            <w:shd w:val="clear" w:color="auto" w:fill="32374D"/>
+            <w:vAlign w:val="center"/>
+            <w:hideMark/>
+          </w:tcPr>
+          <w:p>
+            <w:pPr>
+              <w:spacing w:after="240"/>
+              <w:rPr>
+                <w:rFonts w:ascii="Segoe UI" w:eastAsia="Times New Roman" w:hAnsi="Segoe UI" w:cs="Segoe UI"/>
+                <w:color w:val="DEDEDE"/>
+                <w:sz w:val="20"/>
+                <w:szCs w:val="20"/>
+              </w:rPr>
+            </w:pPr>
+            <w:r>
+              <w:rPr>
+                <w:rFonts w:ascii="Segoe UI" w:eastAsia="Times New Roman" w:hAnsi="Segoe UI" w:cs="Segoe UI"/>
+                <w:color w:val="DEDEDE"/>
+                <w:sz w:val="20"/>
+                <w:szCs w:val="20"/>
+              </w:rPr>
+              <w:t>Memory dump analysis (volatile)</w:t>
+            </w:r>
+          </w:p>
+        </w:tc>
+        <w:tc>
+          <w:tcPr>
+            <w:tcW w:w="0" w:type="auto"/>
+            <w:tcBorders>
+              <w:top w:val="single" w:sz="4" w:space="0" w:color="auto"/>
+              <w:left w:val="single" w:sz="4" w:space="0" w:color="auto"/>
+              <w:bottom w:val="single" w:sz="4" w:space="0" w:color="auto"/>
+              <w:right w:val="single" w:sz="4" w:space="0" w:color="auto"/>
+            </w:tcBorders>
+            <w:shd w:val="clear" w:color="auto" w:fill="32374D"/>
+            <w:vAlign w:val="center"/>
+            <w:hideMark/>
+          </w:tcPr>
+          <w:p>
+            <w:pPr>
+              <w:spacing w:after="240"/>
+              <w:rPr>
+                <w:rFonts w:ascii="Segoe UI" w:eastAsia="Times New Roman" w:hAnsi="Segoe UI" w:cs="Segoe UI"/>
+                <w:color w:val="DEDEDE"/>
+                <w:sz w:val="20"/>
+                <w:szCs w:val="20"/>
+              </w:rPr>
+            </w:pPr>
+            <w:r>
+              <w:rPr>
+                <w:rFonts w:ascii="Segoe UI" w:eastAsia="Times New Roman" w:hAnsi="Segoe UI" w:cs="Segoe UI"/>
+                <w:color w:val="DEDEDE"/>
+                <w:sz w:val="20"/>
+                <w:szCs w:val="20"/>
+              </w:rPr>
+              <w:t xml:space="preserve">Discord's native </w:t>
+            </w:r>
+            <w:proofErr w:type="spellStart"/>
+            <w:r>
+              <w:rPr>
+                <w:rFonts w:ascii="Segoe UI" w:eastAsia="Times New Roman" w:hAnsi="Segoe UI" w:cs="Segoe UI"/>
+                <w:color w:val="DEDEDE"/>
+                <w:sz w:val="20"/>
+                <w:szCs w:val="20"/>
+              </w:rPr>
+              <w:t>MessageCache</w:t>
+            </w:r>
+            <w:proofErr w:type="spellEnd"/>
+            <w:r>
+              <w:rPr>
+                <w:rFonts w:ascii="Segoe UI" w:eastAsia="Times New Roman" w:hAnsi="Segoe UI" w:cs="Segoe UI"/>
+                <w:color w:val="DEDEDE"/>
+                <w:sz w:val="20"/>
+                <w:szCs w:val="20"/>
+              </w:rPr>
+              <w:t xml:space="preserve">; </w:t>
+            </w:r>
+            <w:proofErr w:type="spellStart"/>
+            <w:r>
+              <w:rPr>
+                <w:rFonts w:ascii="Segoe UI" w:eastAsia="Times New Roman" w:hAnsi="Segoe UI" w:cs="Segoe UI"/>
+                <w:color w:val="DEDEDE"/>
+                <w:sz w:val="20"/>
+                <w:szCs w:val="20"/>
+              </w:rPr>
+              <w:t>MessageLogger</w:t>
+            </w:r>
+            <w:proofErr w:type="spellEnd"/>
+            <w:r>
+              <w:rPr>
+                <w:rFonts w:ascii="Segoe UI" w:eastAsia="Times New Roman" w:hAnsi="Segoe UI" w:cs="Segoe UI"/>
+                <w:color w:val="DEDEDE"/>
+                <w:sz w:val="20"/>
+                <w:szCs w:val="20"/>
+              </w:rPr>
+              <w:t xml:space="preserve"> piggybacks on this. Lost on process exit.</w:t>
+            </w:r>
+          </w:p>
+        </w:tc>
+      </w:tr>
+    </w:tbl>
+    <w:p/>
     <w:p>
       <w:pPr>
         <w:pStyle w:val="Heading2"/>
@@ -4494,7 +7347,23 @@
         <w:t>Inputs:</w:t>
       </w:r>
       <w:r>
-        <w:t xml:space="preserve"> deleted message logs (text), message metadata (timestamps, msgIDs), user metadata (display names) — </w:t>
+        <w:t xml:space="preserve"> deleted message logs (text), message metadata (timestamps, </w:t>
+      </w:r>
+      <w:proofErr w:type="spellStart"/>
+      <w:r>
+        <w:t>msgIDs</w:t>
+      </w:r>
+      <w:proofErr w:type="spellEnd"/>
+      <w:r>
+        <w:t xml:space="preserve">), user metadata (display </w:t>
+      </w:r>
+      <w:proofErr w:type="gramStart"/>
+      <w:r>
+        <w:t>names) —</w:t>
+      </w:r>
+      <w:proofErr w:type="gramEnd"/>
+      <w:r>
+        <w:t xml:space="preserve"> </w:t>
       </w:r>
       <w:r>
         <w:rPr>
@@ -4516,7 +7385,15 @@
         <w:t>Processing Steps (high level):</w:t>
       </w:r>
       <w:r>
-        <w:t xml:space="preserve"> 1. Preprocessing: normalize text, remove stopwords, mask obvious PII. 2. Embedding &amp; clustering: semantic embeddings → cluster by topic/personality indicators. 3. Behavioral inference: apply psycholinguistic models to infer traits. 4. Output: persona summaries, high‑value target lists.</w:t>
+        <w:t xml:space="preserve"> 1. Preprocessing: normalize text, remove </w:t>
+      </w:r>
+      <w:proofErr w:type="spellStart"/>
+      <w:r>
+        <w:t>stopwords</w:t>
+      </w:r>
+      <w:proofErr w:type="spellEnd"/>
+      <w:r>
+        <w:t>, mask obvious PII. 2. Embedding &amp; clustering: semantic embeddings → cluster by topic/personality indicators. 3. Behavioral inference: apply psycholinguistic models to infer traits. 4. Output: persona summaries, high‑value target lists.</w:t>
       </w:r>
     </w:p>
     <w:p>
@@ -4573,7 +7450,15 @@
         <w:t>Ethical/Harms:</w:t>
       </w:r>
       <w:r>
-        <w:t xml:space="preserve"> Describe potential harms and mitigation strategies.</w:t>
+        <w:t xml:space="preserve"> Describe potential </w:t>
+      </w:r>
+      <w:proofErr w:type="gramStart"/>
+      <w:r>
+        <w:t>harms</w:t>
+      </w:r>
+      <w:proofErr w:type="gramEnd"/>
+      <w:r>
+        <w:t xml:space="preserve"> and mitigation strategies.</w:t>
       </w:r>
     </w:p>
     <w:p>
@@ -4614,25 +7499,68 @@
         <w:rPr>
           <w:rStyle w:val="VerbatimChar"/>
         </w:rPr>
-        <w:t xml:space="preserve">  B --&gt; C[Embeddings &amp; Clustering]</w:t>
-      </w:r>
-      <w:r>
-        <w:br/>
-      </w:r>
+        <w:lastRenderedPageBreak/>
+        <w:t xml:space="preserve">  B --&gt; </w:t>
+      </w:r>
+      <w:proofErr w:type="gramStart"/>
       <w:r>
         <w:rPr>
           <w:rStyle w:val="VerbatimChar"/>
         </w:rPr>
-        <w:t xml:space="preserve">  C --&gt; D[Behavioral Inference]</w:t>
-      </w:r>
-      <w:r>
-        <w:br/>
-      </w:r>
+        <w:t>C[</w:t>
+      </w:r>
+      <w:proofErr w:type="gramEnd"/>
       <w:r>
         <w:rPr>
           <w:rStyle w:val="VerbatimChar"/>
         </w:rPr>
-        <w:t xml:space="preserve">  D --&gt; E[Persona Profiles]</w:t>
+        <w:t>Embeddings &amp; Clustering]</w:t>
+      </w:r>
+      <w:r>
+        <w:br/>
+      </w:r>
+      <w:r>
+        <w:rPr>
+          <w:rStyle w:val="VerbatimChar"/>
+        </w:rPr>
+        <w:t xml:space="preserve">  C --&gt; </w:t>
+      </w:r>
+      <w:proofErr w:type="gramStart"/>
+      <w:r>
+        <w:rPr>
+          <w:rStyle w:val="VerbatimChar"/>
+        </w:rPr>
+        <w:t>D[</w:t>
+      </w:r>
+      <w:proofErr w:type="gramEnd"/>
+      <w:r>
+        <w:rPr>
+          <w:rStyle w:val="VerbatimChar"/>
+        </w:rPr>
+        <w:t>Behavioral Inference]</w:t>
+      </w:r>
+      <w:r>
+        <w:br/>
+      </w:r>
+      <w:r>
+        <w:rPr>
+          <w:rStyle w:val="VerbatimChar"/>
+        </w:rPr>
+        <w:t xml:space="preserve">  D --&gt; </w:t>
+      </w:r>
+      <w:proofErr w:type="gramStart"/>
+      <w:r>
+        <w:rPr>
+          <w:rStyle w:val="VerbatimChar"/>
+        </w:rPr>
+        <w:t>E[</w:t>
+      </w:r>
+      <w:proofErr w:type="gramEnd"/>
+      <w:r>
+        <w:rPr>
+          <w:rStyle w:val="VerbatimChar"/>
+        </w:rPr>
+        <w:t>Persona Profiles]</w:t>
       </w:r>
     </w:p>
     <w:p>
@@ -4650,7 +7578,15 @@
       <w:bookmarkEnd w:id="6"/>
       <w:bookmarkEnd w:id="7"/>
       <w:r>
-        <w:t>6. Findings Synthesis (2–3 page summary)</w:t>
+        <w:t>6. Findings Synthesis (2–</w:t>
+      </w:r>
+      <w:proofErr w:type="gramStart"/>
+      <w:r>
+        <w:t>3 page</w:t>
+      </w:r>
+      <w:proofErr w:type="gramEnd"/>
+      <w:r>
+        <w:t xml:space="preserve"> summary)</w:t>
       </w:r>
     </w:p>
     <w:p>
@@ -4658,7 +7594,15 @@
         <w:pStyle w:val="BlockText"/>
       </w:pPr>
       <w:r>
-        <w:t>Use this section to draft the technical narrative you will hand off to Phase 2. Structure suggestions: - Executive summary (1 paragraph) - Key technical findings (bulleted) - What assumptions users make vs. reality - Potential AI amplification vectors (high-level, non-actionable) - Limitations &amp; open questions</w:t>
+        <w:t>Use this section to draft the technical narrative you will hand off to Phase 2. Structure suggestions: - Executive summary (1 paragraph) - Key technical findings (</w:t>
+      </w:r>
+      <w:proofErr w:type="gramStart"/>
+      <w:r>
+        <w:t>bulleted</w:t>
+      </w:r>
+      <w:proofErr w:type="gramEnd"/>
+      <w:r>
+        <w:t>) - What assumptions users make vs. reality - Potential AI amplification vectors (high-level, non-actionable) - Limitations &amp; open questions</w:t>
       </w:r>
     </w:p>
     <w:p>
@@ -4675,7 +7619,6 @@
       <w:bookmarkStart w:id="9" w:name="irb-notes-ethics-checklist"/>
       <w:bookmarkEnd w:id="8"/>
       <w:r>
-        <w:lastRenderedPageBreak/>
         <w:t>7. IRB Notes &amp; Ethics Checklist</w:t>
       </w:r>
     </w:p>
@@ -4733,7 +7676,15 @@
         </w:numPr>
       </w:pPr>
       <w:r>
-        <w:t>All outputs will be non-actionable and high-level.</w:t>
+        <w:t xml:space="preserve">All outputs will be non-actionable and </w:t>
+      </w:r>
+      <w:proofErr w:type="gramStart"/>
+      <w:r>
+        <w:t>high-level</w:t>
+      </w:r>
+      <w:proofErr w:type="gramEnd"/>
+      <w:r>
+        <w:t>.</w:t>
       </w:r>
     </w:p>
     <w:p>
@@ -4777,100 +7728,16 @@
       <w:bookmarkStart w:id="10" w:name="todo-action-items-editable-checklist"/>
       <w:bookmarkEnd w:id="9"/>
       <w:r>
-        <w:t>8. To‑Do / Action Items (editable checklist)</w:t>
-      </w:r>
-    </w:p>
-    <w:p>
-      <w:pPr>
-        <w:pStyle w:val="Compact"/>
-        <w:numPr>
-          <w:ilvl w:val="0"/>
-          <w:numId w:val="6"/>
-        </w:numPr>
-      </w:pPr>
-      <w:r>
-        <w:t>Create sandbox server &amp; 3 dummy accounts (anonymized labels).</w:t>
-      </w:r>
-      <w:r>
-        <w:br/>
-      </w:r>
-    </w:p>
-    <w:p>
-      <w:pPr>
-        <w:pStyle w:val="Compact"/>
-        <w:numPr>
-          <w:ilvl w:val="0"/>
-          <w:numId w:val="7"/>
-        </w:numPr>
-      </w:pPr>
-      <w:r>
-        <w:t>Populate annotated bibliography (≥8 sources).</w:t>
-      </w:r>
-      <w:r>
-        <w:br/>
-      </w:r>
-    </w:p>
-    <w:p>
-      <w:pPr>
-        <w:pStyle w:val="Compact"/>
-        <w:numPr>
-          <w:ilvl w:val="0"/>
-          <w:numId w:val="8"/>
-        </w:numPr>
-      </w:pPr>
-      <w:r>
-        <w:t xml:space="preserve">Fill plugin audit rows for </w:t>
+        <w:t>8. To</w:t>
       </w:r>
       <w:r>
         <w:rPr>
-          <w:rStyle w:val="VerbatimChar"/>
+          <w:rFonts w:ascii="Cambria Math" w:hAnsi="Cambria Math" w:cs="Cambria Math"/>
         </w:rPr>
-        <w:t>MessageLogger</w:t>
-      </w:r>
-      <w:r>
-        <w:t xml:space="preserve">, </w:t>
-      </w:r>
-      <w:r>
-        <w:rPr>
-          <w:rStyle w:val="VerbatimChar"/>
-        </w:rPr>
-        <w:t>AlwaysTrust</w:t>
-      </w:r>
-      <w:r>
-        <w:t>, and 3 other plugins.</w:t>
-      </w:r>
-      <w:r>
-        <w:br/>
-      </w:r>
-    </w:p>
-    <w:p>
-      <w:pPr>
-        <w:pStyle w:val="Compact"/>
-        <w:numPr>
-          <w:ilvl w:val="0"/>
-          <w:numId w:val="9"/>
-        </w:numPr>
-      </w:pPr>
-      <w:r>
-        <w:t>Run sandbox cache test and populate artifact table.</w:t>
-      </w:r>
-      <w:r>
-        <w:br/>
-      </w:r>
-    </w:p>
-    <w:p>
-      <w:pPr>
-        <w:pStyle w:val="Compact"/>
-        <w:numPr>
-          <w:ilvl w:val="0"/>
-          <w:numId w:val="10"/>
-        </w:numPr>
-      </w:pPr>
-      <w:r>
-        <w:t>Draft Recon Agent &amp; Forensic Aggregator one-pagers.</w:t>
-      </w:r>
-      <w:r>
-        <w:br/>
+        <w:t>‑</w:t>
+      </w:r>
+      <w:r>
+        <w:t>Do / Action Items (editable checklist)</w:t>
       </w:r>
     </w:p>
     <w:p>
@@ -4882,56 +7749,15 @@
         </w:numPr>
       </w:pPr>
       <w:r>
-        <w:t>Draft 2–3 page technical summary for Phase 2.</w:t>
-      </w:r>
-    </w:p>
-    <w:p>
-      <w:r>
-        <w:pict w14:anchorId="3A3E96B0">
-          <v:rect id="_x0000_i1035" style="width:0;height:1.5pt" o:hralign="center" o:hrstd="t" o:hr="t"/>
-        </w:pict>
-      </w:r>
-    </w:p>
-    <w:p>
-      <w:pPr>
-        <w:pStyle w:val="FirstParagraph"/>
-      </w:pPr>
-      <w:r>
-        <w:rPr>
-          <w:b/>
-          <w:bCs/>
-        </w:rPr>
-        <w:t>Appendix: Quick safe-research reminders</w:t>
-      </w:r>
-      <w:r>
-        <w:t xml:space="preserve"> - Never store screenshots or raw logs that include real usernames or real server names in shared drives without anonymization.</w:t>
-      </w:r>
-      <w:r>
-        <w:br/>
-        <w:t>- When paraphrasing forum posts, change wording and remove unique phrases to prevent search-based re-identification.</w:t>
-      </w:r>
-      <w:r>
-        <w:br/>
-        <w:t>- If uncertain, include the question in IRB notes.</w:t>
-      </w:r>
-    </w:p>
-    <w:p>
-      <w:r>
-        <w:pict w14:anchorId="0E279EAE">
-          <v:rect id="_x0000_i1036" style="width:0;height:1.5pt" o:hralign="center" o:hrstd="t" o:hr="t"/>
-        </w:pict>
-      </w:r>
-    </w:p>
-    <w:p>
-      <w:pPr>
-        <w:pStyle w:val="FirstParagraph"/>
-      </w:pPr>
-      <w:r>
-        <w:rPr>
-          <w:i/>
-          <w:iCs/>
-        </w:rPr>
-        <w:t>End of notebook template.</w:t>
+        <w:t>Draft 2–</w:t>
+      </w:r>
+      <w:proofErr w:type="gramStart"/>
+      <w:r>
+        <w:t>3 page</w:t>
+      </w:r>
+      <w:proofErr w:type="gramEnd"/>
+      <w:r>
+        <w:t xml:space="preserve"> technical summary for Phase 2.</w:t>
       </w:r>
       <w:bookmarkEnd w:id="0"/>
       <w:bookmarkEnd w:id="10"/>
@@ -5652,7 +8478,6 @@
     <w:next w:val="BodyText"/>
     <w:link w:val="Heading2Char"/>
     <w:uiPriority w:val="9"/>
-    <w:semiHidden/>
     <w:unhideWhenUsed/>
     <w:qFormat/>
     <w:rsid w:val="00A10FD9"/>
@@ -5827,6 +8652,7 @@
   <w:style w:type="character" w:default="1" w:styleId="DefaultParagraphFont">
     <w:name w:val="Default Paragraph Font"/>
     <w:uiPriority w:val="1"/>
+    <w:semiHidden/>
     <w:unhideWhenUsed/>
   </w:style>
   <w:style w:type="table" w:default="1" w:styleId="TableNormal">
@@ -6015,7 +8841,6 @@
     <w:basedOn w:val="DefaultParagraphFont"/>
     <w:link w:val="Heading2"/>
     <w:uiPriority w:val="9"/>
-    <w:semiHidden/>
     <w:rsid w:val="00A10FD9"/>
     <w:rPr>
       <w:rFonts w:asciiTheme="majorHAnsi" w:eastAsiaTheme="majorEastAsia" w:hAnsiTheme="majorHAnsi" w:cstheme="majorBidi"/>
@@ -6604,6 +9429,15 @@
       <w:szCs w:val="20"/>
     </w:rPr>
   </w:style>
+  <w:style w:type="character" w:styleId="FollowedHyperlink">
+    <w:name w:val="FollowedHyperlink"/>
+    <w:basedOn w:val="DefaultParagraphFont"/>
+    <w:rsid w:val="007206A5"/>
+    <w:rPr>
+      <w:color w:val="96607D" w:themeColor="followedHyperlink"/>
+      <w:u w:val="single"/>
+    </w:rPr>
+  </w:style>
 </w:styles>
 </file>
 

</xml_diff>